<commit_message>
docs: enlarge font sizes in CareAI 4-part plan docx document
</commit_message>
<xml_diff>
--- a/CareAI_Ke_Hoach_Trien_Khai_4_Phan_v111.docx
+++ b/CareAI_Ke_Hoach_Trien_Khai_4_Phan_v111.docx
@@ -4,7 +4,7 @@
   <w:body>
     <w:p>
       <w:pPr>
-        <w:spacing w:before="0" w:after="80"/>
+        <w:spacing w:before="0" w:after="120"/>
         <w:jc w:val="center"/>
       </w:pPr>
       <w:r>
@@ -12,14 +12,14 @@
           <w:rFonts w:ascii="Calibri" w:hAnsi="Calibri"/>
           <w:b/>
           <w:color w:val="1E3A8A"/>
-          <w:sz w:val="36"/>
+          <w:sz w:val="44"/>
         </w:rPr>
         <w:t>BẢN PHÂN CÔNG NHIỆM VỤ TRIỂN KHAI CAREAI v111.0</w:t>
       </w:r>
     </w:p>
     <w:p>
       <w:pPr>
-        <w:spacing w:before="0" w:after="240"/>
+        <w:spacing w:before="0" w:after="280"/>
         <w:jc w:val="center"/>
       </w:pPr>
       <w:r>
@@ -27,7 +27,7 @@
           <w:rFonts w:ascii="Calibri" w:hAnsi="Calibri"/>
           <w:b/>
           <w:color w:val="475569"/>
-          <w:sz w:val="22"/>
+          <w:sz w:val="26"/>
         </w:rPr>
         <w:t>(CAREAI AIRTIGHT TASK BREAKDOWN &amp; ACTIONABLE ROADMAP)</w:t>
       </w:r>
@@ -39,105 +39,105 @@
         <w:tblLayout w:type="fixed"/>
         <w:tblLook w:firstColumn="1" w:firstRow="1" w:lastColumn="0" w:lastRow="0" w:noHBand="0" w:noVBand="1" w:val="04A0"/>
         <w:tblBorders>
-          <w:top w:val="single" w:sz="8" w:space="0" w:color="93C5FD"/>
-          <w:bottom w:val="single" w:sz="8" w:space="0" w:color="93C5FD"/>
-          <w:left w:val="single" w:sz="8" w:space="0" w:color="93C5FD"/>
-          <w:right w:val="single" w:sz="8" w:space="0" w:color="93C5FD"/>
-          <w:insideH w:val="single" w:sz="8" w:space="0" w:color="93C5FD"/>
-          <w:insideV w:val="single" w:sz="8" w:space="0" w:color="93C5FD"/>
+          <w:top w:val="single" w:sz="10" w:space="0" w:color="93C5FD"/>
+          <w:bottom w:val="single" w:sz="10" w:space="0" w:color="93C5FD"/>
+          <w:left w:val="single" w:sz="10" w:space="0" w:color="93C5FD"/>
+          <w:right w:val="single" w:sz="10" w:space="0" w:color="93C5FD"/>
+          <w:insideH w:val="single" w:sz="10" w:space="0" w:color="93C5FD"/>
+          <w:insideV w:val="single" w:sz="10" w:space="0" w:color="93C5FD"/>
         </w:tblBorders>
       </w:tblPr>
       <w:tblGrid>
-        <w:gridCol w:w="9936"/>
+        <w:gridCol w:w="10080"/>
       </w:tblGrid>
       <w:tr>
         <w:tc>
           <w:tcPr>
-            <w:tcW w:type="dxa" w:w="9936"/>
+            <w:tcW w:type="dxa" w:w="10080"/>
             <w:shd w:fill="F8FAFC"/>
             <w:tcMar>
-              <w:top w:w="140" w:type="dxa"/>
-              <w:bottom w:w="140" w:type="dxa"/>
-              <w:left w:w="180" w:type="dxa"/>
-              <w:right w:w="180" w:type="dxa"/>
+              <w:top w:w="160" w:type="dxa"/>
+              <w:bottom w:w="160" w:type="dxa"/>
+              <w:left w:w="200" w:type="dxa"/>
+              <w:right w:w="200" w:type="dxa"/>
             </w:tcMar>
           </w:tcPr>
           <w:p>
             <w:pPr>
-              <w:spacing w:after="40" w:before="20" w:line="276" w:lineRule="auto"/>
+              <w:spacing w:after="60" w:before="40" w:line="288" w:lineRule="auto"/>
             </w:pPr>
             <w:r>
               <w:rPr>
                 <w:b/>
                 <w:color w:val="1E3A8A"/>
-                <w:sz w:val="20"/>
+                <w:sz w:val="23"/>
               </w:rPr>
               <w:t xml:space="preserve">• Dự án: </w:t>
             </w:r>
             <w:r>
               <w:rPr>
                 <w:color w:val="334155"/>
-                <w:sz w:val="19"/>
+                <w:sz w:val="23"/>
               </w:rPr>
               <w:t>Hệ thống Y tế Từ xa &amp; Cảnh báo Cấp cứu Gia đình CareAI</w:t>
             </w:r>
           </w:p>
           <w:p>
             <w:pPr>
-              <w:spacing w:before="20" w:after="40" w:line="276" w:lineRule="auto"/>
+              <w:spacing w:before="40" w:after="60" w:line="288" w:lineRule="auto"/>
             </w:pPr>
             <w:r>
               <w:rPr>
                 <w:b/>
                 <w:color w:val="1E3A8A"/>
-                <w:sz w:val="20"/>
+                <w:sz w:val="23"/>
               </w:rPr>
               <w:t xml:space="preserve">• Phiên bản kiến trúc: </w:t>
             </w:r>
             <w:r>
               <w:rPr>
                 <w:color w:val="334155"/>
-                <w:sz w:val="19"/>
+                <w:sz w:val="23"/>
               </w:rPr>
               <w:t>Sovereign Modular Monolith (.NET 9 LTS · Azure SQL · Kotlin Direct Boot · Flutter Single Unified App)</w:t>
             </w:r>
           </w:p>
           <w:p>
             <w:pPr>
-              <w:spacing w:before="20" w:after="40" w:line="276" w:lineRule="auto"/>
+              <w:spacing w:before="40" w:after="60" w:line="288" w:lineRule="auto"/>
             </w:pPr>
             <w:r>
               <w:rPr>
                 <w:b/>
                 <w:color w:val="1E3A8A"/>
-                <w:sz w:val="20"/>
+                <w:sz w:val="23"/>
               </w:rPr>
               <w:t xml:space="preserve">• Định vị pháp lý: </w:t>
             </w:r>
             <w:r>
               <w:rPr>
                 <w:color w:val="334155"/>
-                <w:sz w:val="19"/>
+                <w:sz w:val="23"/>
               </w:rPr>
               <w:t>Nền tảng Hỗ trợ Cảnh báo Chăm sóc Người cao tuổi (Non-SaMD)</w:t>
             </w:r>
           </w:p>
           <w:p>
             <w:pPr>
-              <w:spacing w:before="20" w:after="40" w:line="276" w:lineRule="auto"/>
+              <w:spacing w:before="40" w:after="60" w:line="288" w:lineRule="auto"/>
             </w:pPr>
             <w:r>
               <w:rPr>
                 <w:b/>
                 <w:color w:val="1E3A8A"/>
-                <w:sz w:val="20"/>
+                <w:sz w:val="23"/>
               </w:rPr>
               <w:t xml:space="preserve">• Tình trạng nền tảng: </w:t>
             </w:r>
             <w:r>
               <w:rPr>
                 <w:color w:val="334155"/>
-                <w:sz w:val="19"/>
+                <w:sz w:val="23"/>
               </w:rPr>
               <w:t>Backend 36/36 Facts Passed, Direct Boot &amp; HIL 8/8 Passed trên Samsung A55, CSDL Azure SQL Cloud hoạt động, App di động hợp nhất.</w:t>
             </w:r>
@@ -147,20 +147,20 @@
     </w:tbl>
     <w:p>
       <w:pPr>
-        <w:spacing w:before="0" w:after="120"/>
+        <w:spacing w:before="0" w:after="160"/>
       </w:pPr>
     </w:p>
     <w:p>
       <w:pPr>
         <w:keepNext/>
-        <w:spacing w:before="280" w:after="120"/>
+        <w:spacing w:before="320" w:after="120"/>
       </w:pPr>
       <w:r>
         <w:rPr>
           <w:rFonts w:ascii="Calibri" w:hAnsi="Calibri"/>
           <w:b/>
           <w:color w:val="1E3A8A"/>
-          <w:sz w:val="27"/>
+          <w:sz w:val="31"/>
         </w:rPr>
         <w:t>1. TỔNG QUAN PHÂN BỔ NHIỆM VỤ 4 PHẦN</w:t>
       </w:r>
@@ -172,31 +172,31 @@
         <w:tblLayout w:type="fixed"/>
         <w:tblLook w:firstColumn="1" w:firstRow="1" w:lastColumn="0" w:lastRow="0" w:noHBand="0" w:noVBand="1" w:val="04A0"/>
         <w:tblBorders>
-          <w:top w:val="single" w:sz="4" w:space="0" w:color="CBD5E1"/>
-          <w:bottom w:val="single" w:sz="4" w:space="0" w:color="CBD5E1"/>
-          <w:left w:val="single" w:sz="4" w:space="0" w:color="CBD5E1"/>
-          <w:right w:val="single" w:sz="4" w:space="0" w:color="CBD5E1"/>
-          <w:insideH w:val="single" w:sz="4" w:space="0" w:color="CBD5E1"/>
-          <w:insideV w:val="single" w:sz="4" w:space="0" w:color="CBD5E1"/>
+          <w:top w:val="single" w:sz="6" w:space="0" w:color="CBD5E1"/>
+          <w:bottom w:val="single" w:sz="6" w:space="0" w:color="CBD5E1"/>
+          <w:left w:val="single" w:sz="6" w:space="0" w:color="CBD5E1"/>
+          <w:right w:val="single" w:sz="6" w:space="0" w:color="CBD5E1"/>
+          <w:insideH w:val="single" w:sz="6" w:space="0" w:color="CBD5E1"/>
+          <w:insideV w:val="single" w:sz="6" w:space="0" w:color="CBD5E1"/>
         </w:tblBorders>
       </w:tblPr>
       <w:tblGrid>
-        <w:gridCol w:w="1987"/>
-        <w:gridCol w:w="1987"/>
-        <w:gridCol w:w="1987"/>
-        <w:gridCol w:w="1987"/>
-        <w:gridCol w:w="1987"/>
+        <w:gridCol w:w="2016"/>
+        <w:gridCol w:w="2016"/>
+        <w:gridCol w:w="2016"/>
+        <w:gridCol w:w="2016"/>
+        <w:gridCol w:w="2016"/>
       </w:tblGrid>
       <w:tr>
         <w:tc>
           <w:tcPr>
-            <w:tcW w:type="dxa" w:w="1440"/>
+            <w:tcW w:type="dxa" w:w="1584"/>
             <w:shd w:fill="1E3A8A"/>
             <w:tcMar>
-              <w:top w:w="120" w:type="dxa"/>
-              <w:bottom w:w="120" w:type="dxa"/>
-              <w:left w:w="140" w:type="dxa"/>
-              <w:right w:w="140" w:type="dxa"/>
+              <w:top w:w="140" w:type="dxa"/>
+              <w:bottom w:w="140" w:type="dxa"/>
+              <w:left w:w="150" w:type="dxa"/>
+              <w:right w:w="150" w:type="dxa"/>
             </w:tcMar>
           </w:tcPr>
           <w:p>
@@ -208,7 +208,7 @@
               <w:rPr>
                 <w:b/>
                 <w:color w:val="FFFFFF"/>
-                <w:sz w:val="19"/>
+                <w:sz w:val="22"/>
               </w:rPr>
               <w:t>Phân Phần</w:t>
             </w:r>
@@ -216,13 +216,13 @@
         </w:tc>
         <w:tc>
           <w:tcPr>
-            <w:tcW w:type="dxa" w:w="1584"/>
+            <w:tcW w:type="dxa" w:w="1728"/>
             <w:shd w:fill="1E3A8A"/>
             <w:tcMar>
-              <w:top w:w="120" w:type="dxa"/>
-              <w:bottom w:w="120" w:type="dxa"/>
-              <w:left w:w="140" w:type="dxa"/>
-              <w:right w:w="140" w:type="dxa"/>
+              <w:top w:w="140" w:type="dxa"/>
+              <w:bottom w:w="140" w:type="dxa"/>
+              <w:left w:w="150" w:type="dxa"/>
+              <w:right w:w="150" w:type="dxa"/>
             </w:tcMar>
           </w:tcPr>
           <w:p>
@@ -234,7 +234,7 @@
               <w:rPr>
                 <w:b/>
                 <w:color w:val="FFFFFF"/>
-                <w:sz w:val="19"/>
+                <w:sz w:val="22"/>
               </w:rPr>
               <w:t>Thành Viên Đảm Nhận</w:t>
             </w:r>
@@ -242,13 +242,13 @@
         </w:tc>
         <w:tc>
           <w:tcPr>
-            <w:tcW w:type="dxa" w:w="2592"/>
+            <w:tcW w:type="dxa" w:w="3168"/>
             <w:shd w:fill="1E3A8A"/>
             <w:tcMar>
-              <w:top w:w="120" w:type="dxa"/>
-              <w:bottom w:w="120" w:type="dxa"/>
-              <w:left w:w="140" w:type="dxa"/>
-              <w:right w:w="140" w:type="dxa"/>
+              <w:top w:w="140" w:type="dxa"/>
+              <w:bottom w:w="140" w:type="dxa"/>
+              <w:left w:w="150" w:type="dxa"/>
+              <w:right w:w="150" w:type="dxa"/>
             </w:tcMar>
           </w:tcPr>
           <w:p>
@@ -260,7 +260,7 @@
               <w:rPr>
                 <w:b/>
                 <w:color w:val="FFFFFF"/>
-                <w:sz w:val="19"/>
+                <w:sz w:val="22"/>
               </w:rPr>
               <w:t>Tên Nhiệm Vụ Trọng Tâm</w:t>
             </w:r>
@@ -268,13 +268,13 @@
         </w:tc>
         <w:tc>
           <w:tcPr>
-            <w:tcW w:type="dxa" w:w="1728"/>
+            <w:tcW w:type="dxa" w:w="1584"/>
             <w:shd w:fill="1E3A8A"/>
             <w:tcMar>
-              <w:top w:w="120" w:type="dxa"/>
-              <w:bottom w:w="120" w:type="dxa"/>
-              <w:left w:w="140" w:type="dxa"/>
-              <w:right w:w="140" w:type="dxa"/>
+              <w:top w:w="140" w:type="dxa"/>
+              <w:bottom w:w="140" w:type="dxa"/>
+              <w:left w:w="150" w:type="dxa"/>
+              <w:right w:w="150" w:type="dxa"/>
             </w:tcMar>
           </w:tcPr>
           <w:p>
@@ -286,7 +286,7 @@
               <w:rPr>
                 <w:b/>
                 <w:color w:val="FFFFFF"/>
-                <w:sz w:val="19"/>
+                <w:sz w:val="22"/>
               </w:rPr>
               <w:t>Use Case Phụ Trách</w:t>
             </w:r>
@@ -294,13 +294,13 @@
         </w:tc>
         <w:tc>
           <w:tcPr>
-            <w:tcW w:type="dxa" w:w="2592"/>
+            <w:tcW w:type="dxa" w:w="2016"/>
             <w:shd w:fill="1E3A8A"/>
             <w:tcMar>
-              <w:top w:w="120" w:type="dxa"/>
-              <w:bottom w:w="120" w:type="dxa"/>
-              <w:left w:w="140" w:type="dxa"/>
-              <w:right w:w="140" w:type="dxa"/>
+              <w:top w:w="140" w:type="dxa"/>
+              <w:bottom w:w="140" w:type="dxa"/>
+              <w:left w:w="150" w:type="dxa"/>
+              <w:right w:w="150" w:type="dxa"/>
             </w:tcMar>
           </w:tcPr>
           <w:p>
@@ -312,7 +312,7 @@
               <w:rPr>
                 <w:b/>
                 <w:color w:val="FFFFFF"/>
-                <w:sz w:val="19"/>
+                <w:sz w:val="22"/>
               </w:rPr>
               <w:t>Phân Hệ Liên Quan</w:t>
             </w:r>
@@ -322,13 +322,13 @@
       <w:tr>
         <w:tc>
           <w:tcPr>
-            <w:tcW w:type="dxa" w:w="1440"/>
+            <w:tcW w:type="dxa" w:w="1584"/>
             <w:shd w:fill="FFFFFF"/>
             <w:tcMar>
-              <w:top w:w="100" w:type="dxa"/>
-              <w:bottom w:w="100" w:type="dxa"/>
-              <w:left w:w="120" w:type="dxa"/>
-              <w:right w:w="120" w:type="dxa"/>
+              <w:top w:w="120" w:type="dxa"/>
+              <w:bottom w:w="120" w:type="dxa"/>
+              <w:left w:w="130" w:type="dxa"/>
+              <w:right w:w="130" w:type="dxa"/>
             </w:tcMar>
           </w:tcPr>
           <w:p>
@@ -339,7 +339,7 @@
             <w:r>
               <w:rPr>
                 <w:b/>
-                <w:sz w:val="18"/>
+                <w:sz w:val="22"/>
               </w:rPr>
               <w:t>Phần 1</w:t>
             </w:r>
@@ -347,13 +347,13 @@
         </w:tc>
         <w:tc>
           <w:tcPr>
-            <w:tcW w:type="dxa" w:w="1584"/>
+            <w:tcW w:type="dxa" w:w="1728"/>
             <w:shd w:fill="FFFFFF"/>
             <w:tcMar>
-              <w:top w:w="100" w:type="dxa"/>
-              <w:bottom w:w="100" w:type="dxa"/>
-              <w:left w:w="120" w:type="dxa"/>
-              <w:right w:w="120" w:type="dxa"/>
+              <w:top w:w="120" w:type="dxa"/>
+              <w:bottom w:w="120" w:type="dxa"/>
+              <w:left w:w="130" w:type="dxa"/>
+              <w:right w:w="130" w:type="dxa"/>
             </w:tcMar>
           </w:tcPr>
           <w:p>
@@ -365,7 +365,7 @@
               <w:rPr>
                 <w:b/>
                 <w:color w:val="1E3A8A"/>
-                <w:sz w:val="18"/>
+                <w:sz w:val="22"/>
               </w:rPr>
               <w:t>Hiếu</w:t>
             </w:r>
@@ -373,13 +373,13 @@
         </w:tc>
         <w:tc>
           <w:tcPr>
-            <w:tcW w:type="dxa" w:w="2592"/>
+            <w:tcW w:type="dxa" w:w="3168"/>
             <w:shd w:fill="FFFFFF"/>
             <w:tcMar>
-              <w:top w:w="100" w:type="dxa"/>
-              <w:bottom w:w="100" w:type="dxa"/>
-              <w:left w:w="120" w:type="dxa"/>
-              <w:right w:w="120" w:type="dxa"/>
+              <w:top w:w="120" w:type="dxa"/>
+              <w:bottom w:w="120" w:type="dxa"/>
+              <w:left w:w="130" w:type="dxa"/>
+              <w:right w:w="130" w:type="dxa"/>
             </w:tcMar>
           </w:tcPr>
           <w:p>
@@ -390,7 +390,7 @@
             <w:r>
               <w:rPr>
                 <w:b/>
-                <w:sz w:val="18"/>
+                <w:sz w:val="22"/>
               </w:rPr>
               <w:t>Trục Viễn Trắc, Đồng Bộ Smartwatch, GPS &amp; Thích Nghi Ngưỡng</w:t>
             </w:r>
@@ -398,13 +398,13 @@
         </w:tc>
         <w:tc>
           <w:tcPr>
-            <w:tcW w:type="dxa" w:w="1728"/>
+            <w:tcW w:type="dxa" w:w="1584"/>
             <w:shd w:fill="FFFFFF"/>
             <w:tcMar>
-              <w:top w:w="100" w:type="dxa"/>
-              <w:bottom w:w="100" w:type="dxa"/>
-              <w:left w:w="120" w:type="dxa"/>
-              <w:right w:w="120" w:type="dxa"/>
+              <w:top w:w="120" w:type="dxa"/>
+              <w:bottom w:w="120" w:type="dxa"/>
+              <w:left w:w="130" w:type="dxa"/>
+              <w:right w:w="130" w:type="dxa"/>
             </w:tcMar>
           </w:tcPr>
           <w:p>
@@ -414,7 +414,7 @@
             </w:pPr>
             <w:r>
               <w:rPr>
-                <w:sz w:val="18"/>
+                <w:sz w:val="22"/>
               </w:rPr>
               <w:t>UC-04, UC-05, UC-10, UC-11</w:t>
             </w:r>
@@ -422,13 +422,13 @@
         </w:tc>
         <w:tc>
           <w:tcPr>
-            <w:tcW w:type="dxa" w:w="2592"/>
+            <w:tcW w:type="dxa" w:w="2016"/>
             <w:shd w:fill="FFFFFF"/>
             <w:tcMar>
-              <w:top w:w="100" w:type="dxa"/>
-              <w:bottom w:w="100" w:type="dxa"/>
-              <w:left w:w="120" w:type="dxa"/>
-              <w:right w:w="120" w:type="dxa"/>
+              <w:top w:w="120" w:type="dxa"/>
+              <w:bottom w:w="120" w:type="dxa"/>
+              <w:left w:w="130" w:type="dxa"/>
+              <w:right w:w="130" w:type="dxa"/>
             </w:tcMar>
           </w:tcPr>
           <w:p>
@@ -438,7 +438,7 @@
             </w:pPr>
             <w:r>
               <w:rPr>
-                <w:sz w:val="18"/>
+                <w:sz w:val="22"/>
               </w:rPr>
               <w:t>Mobile Companion, Backend API, Infrastructure, CSDL Azure SQL</w:t>
             </w:r>
@@ -448,13 +448,13 @@
       <w:tr>
         <w:tc>
           <w:tcPr>
-            <w:tcW w:type="dxa" w:w="1440"/>
+            <w:tcW w:type="dxa" w:w="1584"/>
             <w:shd w:fill="F8FAFC"/>
             <w:tcMar>
-              <w:top w:w="100" w:type="dxa"/>
-              <w:bottom w:w="100" w:type="dxa"/>
-              <w:left w:w="120" w:type="dxa"/>
-              <w:right w:w="120" w:type="dxa"/>
+              <w:top w:w="120" w:type="dxa"/>
+              <w:bottom w:w="120" w:type="dxa"/>
+              <w:left w:w="130" w:type="dxa"/>
+              <w:right w:w="130" w:type="dxa"/>
             </w:tcMar>
           </w:tcPr>
           <w:p>
@@ -465,7 +465,7 @@
             <w:r>
               <w:rPr>
                 <w:b/>
-                <w:sz w:val="18"/>
+                <w:sz w:val="22"/>
               </w:rPr>
               <w:t>Phần 2</w:t>
             </w:r>
@@ -473,13 +473,13 @@
         </w:tc>
         <w:tc>
           <w:tcPr>
-            <w:tcW w:type="dxa" w:w="1584"/>
+            <w:tcW w:type="dxa" w:w="1728"/>
             <w:shd w:fill="F8FAFC"/>
             <w:tcMar>
-              <w:top w:w="100" w:type="dxa"/>
-              <w:bottom w:w="100" w:type="dxa"/>
-              <w:left w:w="120" w:type="dxa"/>
-              <w:right w:w="120" w:type="dxa"/>
+              <w:top w:w="120" w:type="dxa"/>
+              <w:bottom w:w="120" w:type="dxa"/>
+              <w:left w:w="130" w:type="dxa"/>
+              <w:right w:w="130" w:type="dxa"/>
             </w:tcMar>
           </w:tcPr>
           <w:p>
@@ -491,7 +491,7 @@
               <w:rPr>
                 <w:b/>
                 <w:color w:val="1E3A8A"/>
-                <w:sz w:val="18"/>
+                <w:sz w:val="22"/>
               </w:rPr>
               <w:t>Tài</w:t>
             </w:r>
@@ -499,13 +499,13 @@
         </w:tc>
         <w:tc>
           <w:tcPr>
-            <w:tcW w:type="dxa" w:w="2592"/>
+            <w:tcW w:type="dxa" w:w="3168"/>
             <w:shd w:fill="F8FAFC"/>
             <w:tcMar>
-              <w:top w:w="100" w:type="dxa"/>
-              <w:bottom w:w="100" w:type="dxa"/>
-              <w:left w:w="120" w:type="dxa"/>
-              <w:right w:w="120" w:type="dxa"/>
+              <w:top w:w="120" w:type="dxa"/>
+              <w:bottom w:w="120" w:type="dxa"/>
+              <w:left w:w="130" w:type="dxa"/>
+              <w:right w:w="130" w:type="dxa"/>
             </w:tcMar>
           </w:tcPr>
           <w:p>
@@ -516,7 +516,7 @@
             <w:r>
               <w:rPr>
                 <w:b/>
-                <w:sz w:val="18"/>
+                <w:sz w:val="22"/>
               </w:rPr>
               <w:t>Trục Trung Tâm Cấp Cứu, Điều Phối Quorum SLA 60s &amp; Dấu Vết Pháp Y</w:t>
             </w:r>
@@ -524,13 +524,13 @@
         </w:tc>
         <w:tc>
           <w:tcPr>
-            <w:tcW w:type="dxa" w:w="1728"/>
+            <w:tcW w:type="dxa" w:w="1584"/>
             <w:shd w:fill="F8FAFC"/>
             <w:tcMar>
-              <w:top w:w="100" w:type="dxa"/>
-              <w:bottom w:w="100" w:type="dxa"/>
-              <w:left w:w="120" w:type="dxa"/>
-              <w:right w:w="120" w:type="dxa"/>
+              <w:top w:w="120" w:type="dxa"/>
+              <w:bottom w:w="120" w:type="dxa"/>
+              <w:left w:w="130" w:type="dxa"/>
+              <w:right w:w="130" w:type="dxa"/>
             </w:tcMar>
           </w:tcPr>
           <w:p>
@@ -540,7 +540,7 @@
             </w:pPr>
             <w:r>
               <w:rPr>
-                <w:sz w:val="18"/>
+                <w:sz w:val="22"/>
               </w:rPr>
               <w:t>UC-06, UC-07, UC-08, UC-14</w:t>
             </w:r>
@@ -548,13 +548,13 @@
         </w:tc>
         <w:tc>
           <w:tcPr>
-            <w:tcW w:type="dxa" w:w="2592"/>
+            <w:tcW w:type="dxa" w:w="2016"/>
             <w:shd w:fill="F8FAFC"/>
             <w:tcMar>
-              <w:top w:w="100" w:type="dxa"/>
-              <w:bottom w:w="100" w:type="dxa"/>
-              <w:left w:w="120" w:type="dxa"/>
-              <w:right w:w="120" w:type="dxa"/>
+              <w:top w:w="120" w:type="dxa"/>
+              <w:bottom w:w="120" w:type="dxa"/>
+              <w:left w:w="130" w:type="dxa"/>
+              <w:right w:w="130" w:type="dxa"/>
             </w:tcMar>
           </w:tcPr>
           <w:p>
@@ -564,7 +564,7 @@
             </w:pPr>
             <w:r>
               <w:rPr>
-                <w:sz w:val="18"/>
+                <w:sz w:val="22"/>
               </w:rPr>
               <w:t>Core Clinical Engine, Infrastructure Workers, Backend API, Mobile</w:t>
             </w:r>
@@ -574,13 +574,13 @@
       <w:tr>
         <w:tc>
           <w:tcPr>
-            <w:tcW w:type="dxa" w:w="1440"/>
+            <w:tcW w:type="dxa" w:w="1584"/>
             <w:shd w:fill="FFFFFF"/>
             <w:tcMar>
-              <w:top w:w="100" w:type="dxa"/>
-              <w:bottom w:w="100" w:type="dxa"/>
-              <w:left w:w="120" w:type="dxa"/>
-              <w:right w:w="120" w:type="dxa"/>
+              <w:top w:w="120" w:type="dxa"/>
+              <w:bottom w:w="120" w:type="dxa"/>
+              <w:left w:w="130" w:type="dxa"/>
+              <w:right w:w="130" w:type="dxa"/>
             </w:tcMar>
           </w:tcPr>
           <w:p>
@@ -591,7 +591,7 @@
             <w:r>
               <w:rPr>
                 <w:b/>
-                <w:sz w:val="18"/>
+                <w:sz w:val="22"/>
               </w:rPr>
               <w:t>Phần 3</w:t>
             </w:r>
@@ -599,13 +599,13 @@
         </w:tc>
         <w:tc>
           <w:tcPr>
-            <w:tcW w:type="dxa" w:w="1584"/>
+            <w:tcW w:type="dxa" w:w="1728"/>
             <w:shd w:fill="FFFFFF"/>
             <w:tcMar>
-              <w:top w:w="100" w:type="dxa"/>
-              <w:bottom w:w="100" w:type="dxa"/>
-              <w:left w:w="120" w:type="dxa"/>
-              <w:right w:w="120" w:type="dxa"/>
+              <w:top w:w="120" w:type="dxa"/>
+              <w:bottom w:w="120" w:type="dxa"/>
+              <w:left w:w="130" w:type="dxa"/>
+              <w:right w:w="130" w:type="dxa"/>
             </w:tcMar>
           </w:tcPr>
           <w:p>
@@ -617,7 +617,7 @@
               <w:rPr>
                 <w:b/>
                 <w:color w:val="1E3A8A"/>
-                <w:sz w:val="18"/>
+                <w:sz w:val="22"/>
               </w:rPr>
               <w:t>Thịnh</w:t>
             </w:r>
@@ -625,13 +625,13 @@
         </w:tc>
         <w:tc>
           <w:tcPr>
-            <w:tcW w:type="dxa" w:w="2592"/>
+            <w:tcW w:type="dxa" w:w="3168"/>
             <w:shd w:fill="FFFFFF"/>
             <w:tcMar>
-              <w:top w:w="100" w:type="dxa"/>
-              <w:bottom w:w="100" w:type="dxa"/>
-              <w:left w:w="120" w:type="dxa"/>
-              <w:right w:w="120" w:type="dxa"/>
+              <w:top w:w="120" w:type="dxa"/>
+              <w:bottom w:w="120" w:type="dxa"/>
+              <w:left w:w="130" w:type="dxa"/>
+              <w:right w:w="130" w:type="dxa"/>
             </w:tcMar>
           </w:tcPr>
           <w:p>
@@ -642,7 +642,7 @@
             <w:r>
               <w:rPr>
                 <w:b/>
-                <w:sz w:val="18"/>
+                <w:sz w:val="22"/>
               </w:rPr>
               <w:t>Trục Quản Trị Nhóm Gia Đình, Mã Mời 6 Số, RBAC &amp; Vòng Đời Thiết Bị</w:t>
             </w:r>
@@ -650,13 +650,13 @@
         </w:tc>
         <w:tc>
           <w:tcPr>
-            <w:tcW w:type="dxa" w:w="1728"/>
+            <w:tcW w:type="dxa" w:w="1584"/>
             <w:shd w:fill="FFFFFF"/>
             <w:tcMar>
-              <w:top w:w="100" w:type="dxa"/>
-              <w:bottom w:w="100" w:type="dxa"/>
-              <w:left w:w="120" w:type="dxa"/>
-              <w:right w:w="120" w:type="dxa"/>
+              <w:top w:w="120" w:type="dxa"/>
+              <w:bottom w:w="120" w:type="dxa"/>
+              <w:left w:w="130" w:type="dxa"/>
+              <w:right w:w="130" w:type="dxa"/>
             </w:tcMar>
           </w:tcPr>
           <w:p>
@@ -666,7 +666,7 @@
             </w:pPr>
             <w:r>
               <w:rPr>
-                <w:sz w:val="18"/>
+                <w:sz w:val="22"/>
               </w:rPr>
               <w:t>UC-01, UC-02, UC-03, UC-12, UC-13</w:t>
             </w:r>
@@ -674,13 +674,13 @@
         </w:tc>
         <w:tc>
           <w:tcPr>
-            <w:tcW w:type="dxa" w:w="2592"/>
+            <w:tcW w:type="dxa" w:w="2016"/>
             <w:shd w:fill="FFFFFF"/>
             <w:tcMar>
-              <w:top w:w="100" w:type="dxa"/>
-              <w:bottom w:w="100" w:type="dxa"/>
-              <w:left w:w="120" w:type="dxa"/>
-              <w:right w:w="120" w:type="dxa"/>
+              <w:top w:w="120" w:type="dxa"/>
+              <w:bottom w:w="120" w:type="dxa"/>
+              <w:left w:w="130" w:type="dxa"/>
+              <w:right w:w="130" w:type="dxa"/>
             </w:tcMar>
           </w:tcPr>
           <w:p>
@@ -690,7 +690,7 @@
             </w:pPr>
             <w:r>
               <w:rPr>
-                <w:sz w:val="18"/>
+                <w:sz w:val="22"/>
               </w:rPr>
               <w:t>Core Auth, Backend API, Mobile App Caregiver</w:t>
             </w:r>
@@ -700,13 +700,13 @@
       <w:tr>
         <w:tc>
           <w:tcPr>
-            <w:tcW w:type="dxa" w:w="1440"/>
+            <w:tcW w:type="dxa" w:w="1584"/>
             <w:shd w:fill="F8FAFC"/>
             <w:tcMar>
-              <w:top w:w="100" w:type="dxa"/>
-              <w:bottom w:w="100" w:type="dxa"/>
-              <w:left w:w="120" w:type="dxa"/>
-              <w:right w:w="120" w:type="dxa"/>
+              <w:top w:w="120" w:type="dxa"/>
+              <w:bottom w:w="120" w:type="dxa"/>
+              <w:left w:w="130" w:type="dxa"/>
+              <w:right w:w="130" w:type="dxa"/>
             </w:tcMar>
           </w:tcPr>
           <w:p>
@@ -717,7 +717,7 @@
             <w:r>
               <w:rPr>
                 <w:b/>
-                <w:sz w:val="18"/>
+                <w:sz w:val="22"/>
               </w:rPr>
               <w:t>Phần 4</w:t>
             </w:r>
@@ -725,13 +725,13 @@
         </w:tc>
         <w:tc>
           <w:tcPr>
-            <w:tcW w:type="dxa" w:w="1584"/>
+            <w:tcW w:type="dxa" w:w="1728"/>
             <w:shd w:fill="F8FAFC"/>
             <w:tcMar>
-              <w:top w:w="100" w:type="dxa"/>
-              <w:bottom w:w="100" w:type="dxa"/>
-              <w:left w:w="120" w:type="dxa"/>
-              <w:right w:w="120" w:type="dxa"/>
+              <w:top w:w="120" w:type="dxa"/>
+              <w:bottom w:w="120" w:type="dxa"/>
+              <w:left w:w="130" w:type="dxa"/>
+              <w:right w:w="130" w:type="dxa"/>
             </w:tcMar>
           </w:tcPr>
           <w:p>
@@ -743,7 +743,7 @@
               <w:rPr>
                 <w:b/>
                 <w:color w:val="1E3A8A"/>
-                <w:sz w:val="18"/>
+                <w:sz w:val="22"/>
               </w:rPr>
               <w:t>Hiển</w:t>
             </w:r>
@@ -751,13 +751,13 @@
         </w:tc>
         <w:tc>
           <w:tcPr>
-            <w:tcW w:type="dxa" w:w="2592"/>
+            <w:tcW w:type="dxa" w:w="3168"/>
             <w:shd w:fill="F8FAFC"/>
             <w:tcMar>
-              <w:top w:w="100" w:type="dxa"/>
-              <w:bottom w:w="100" w:type="dxa"/>
-              <w:left w:w="120" w:type="dxa"/>
-              <w:right w:w="120" w:type="dxa"/>
+              <w:top w:w="120" w:type="dxa"/>
+              <w:bottom w:w="120" w:type="dxa"/>
+              <w:left w:w="130" w:type="dxa"/>
+              <w:right w:w="130" w:type="dxa"/>
             </w:tcMar>
           </w:tcPr>
           <w:p>
@@ -768,7 +768,7 @@
             <w:r>
               <w:rPr>
                 <w:b/>
-                <w:sz w:val="18"/>
+                <w:sz w:val="22"/>
               </w:rPr>
               <w:t>Trục Trí Tuệ Nhân Tạo (ML.NET) Phân Tích Dị Biệt &amp; Báo Cáo Tuần</w:t>
             </w:r>
@@ -776,13 +776,13 @@
         </w:tc>
         <w:tc>
           <w:tcPr>
-            <w:tcW w:type="dxa" w:w="1728"/>
+            <w:tcW w:type="dxa" w:w="1584"/>
             <w:shd w:fill="F8FAFC"/>
             <w:tcMar>
-              <w:top w:w="100" w:type="dxa"/>
-              <w:bottom w:w="100" w:type="dxa"/>
-              <w:left w:w="120" w:type="dxa"/>
-              <w:right w:w="120" w:type="dxa"/>
+              <w:top w:w="120" w:type="dxa"/>
+              <w:bottom w:w="120" w:type="dxa"/>
+              <w:left w:w="130" w:type="dxa"/>
+              <w:right w:w="130" w:type="dxa"/>
             </w:tcMar>
           </w:tcPr>
           <w:p>
@@ -792,7 +792,7 @@
             </w:pPr>
             <w:r>
               <w:rPr>
-                <w:sz w:val="18"/>
+                <w:sz w:val="22"/>
               </w:rPr>
               <w:t>UC-15, UC-16</w:t>
             </w:r>
@@ -800,13 +800,13 @@
         </w:tc>
         <w:tc>
           <w:tcPr>
-            <w:tcW w:type="dxa" w:w="2592"/>
+            <w:tcW w:type="dxa" w:w="2016"/>
             <w:shd w:fill="F8FAFC"/>
             <w:tcMar>
-              <w:top w:w="100" w:type="dxa"/>
-              <w:bottom w:w="100" w:type="dxa"/>
-              <w:left w:w="120" w:type="dxa"/>
-              <w:right w:w="120" w:type="dxa"/>
+              <w:top w:w="120" w:type="dxa"/>
+              <w:bottom w:w="120" w:type="dxa"/>
+              <w:left w:w="130" w:type="dxa"/>
+              <w:right w:w="130" w:type="dxa"/>
             </w:tcMar>
           </w:tcPr>
           <w:p>
@@ -816,7 +816,7 @@
             </w:pPr>
             <w:r>
               <w:rPr>
-                <w:sz w:val="18"/>
+                <w:sz w:val="22"/>
               </w:rPr>
               <w:t>Infrastructure ML.NET Worker, Prompt Engine, Azure SQL, Mobile</w:t>
             </w:r>
@@ -826,20 +826,20 @@
     </w:tbl>
     <w:p>
       <w:pPr>
-        <w:spacing w:before="0" w:after="120"/>
+        <w:spacing w:before="0" w:after="160"/>
       </w:pPr>
     </w:p>
     <w:p>
       <w:pPr>
         <w:keepNext/>
-        <w:spacing w:before="280" w:after="120"/>
+        <w:spacing w:before="320" w:after="120"/>
       </w:pPr>
       <w:r>
         <w:rPr>
           <w:rFonts w:ascii="Calibri" w:hAnsi="Calibri"/>
           <w:b/>
           <w:color w:val="1E3A8A"/>
-          <w:sz w:val="27"/>
+          <w:sz w:val="31"/>
         </w:rPr>
         <w:t>2. PHẦN 1: TRỤC VIỄN TRẮC, ĐỒNG BỘ SMARTWATCH, GPS &amp; TỰ ĐIỀU CHỈNH NGƯỠNG THÍCH NGHI (Phụ Trách: Hiếu)</w:t>
       </w:r>
@@ -847,14 +847,14 @@
     <w:p>
       <w:pPr>
         <w:keepNext/>
-        <w:spacing w:before="200" w:after="80"/>
+        <w:spacing w:before="240" w:after="80"/>
       </w:pPr>
       <w:r>
         <w:rPr>
           <w:rFonts w:ascii="Calibri" w:hAnsi="Calibri"/>
           <w:b/>
           <w:color w:val="0F766E"/>
-          <w:sz w:val="23"/>
+          <w:sz w:val="27"/>
         </w:rPr>
         <w:t>2.1 Danh Mục Nhiệm Vụ Cụ Thể</w:t>
       </w:r>
@@ -862,12 +862,12 @@
     <w:p>
       <w:pPr>
         <w:keepNext/>
-        <w:spacing w:before="160" w:after="40"/>
+        <w:spacing w:before="200" w:after="60"/>
         <w:ind w:left="216"/>
       </w:pPr>
       <w:r>
         <w:rPr>
-          <w:sz w:val="21"/>
+          <w:sz w:val="24"/>
         </w:rPr>
         <w:t xml:space="preserve">🔹 </w:t>
       </w:r>
@@ -875,128 +875,128 @@
         <w:rPr>
           <w:b/>
           <w:color w:val="0F172A"/>
-          <w:sz w:val="21"/>
+          <w:sz w:val="25"/>
         </w:rPr>
         <w:t>Nhiệm vụ 1.1 - Thu Thập Sinh Hiệu Google Health Connect &amp; Android WorkManager</w:t>
       </w:r>
     </w:p>
     <w:p>
       <w:pPr>
-        <w:spacing w:before="20" w:after="40"/>
+        <w:spacing w:before="40" w:after="60" w:line="288" w:lineRule="auto"/>
         <w:ind w:left="504"/>
       </w:pPr>
       <w:r>
         <w:rPr>
           <w:b/>
           <w:color w:val="1E293B"/>
-          <w:sz w:val="19"/>
+          <w:sz w:val="23"/>
         </w:rPr>
         <w:t xml:space="preserve">• Phân hệ: </w:t>
       </w:r>
       <w:r>
         <w:rPr>
           <w:color w:val="475569"/>
-          <w:sz w:val="19"/>
+          <w:sz w:val="23"/>
         </w:rPr>
         <w:t>`CareAI/companion_app` (Flutter &amp; Android Kotlin Native)</w:t>
       </w:r>
     </w:p>
     <w:p>
       <w:pPr>
-        <w:spacing w:before="20" w:after="40"/>
+        <w:spacing w:before="40" w:after="60" w:line="288" w:lineRule="auto"/>
         <w:ind w:left="504"/>
       </w:pPr>
       <w:r>
         <w:rPr>
           <w:b/>
           <w:color w:val="1E293B"/>
-          <w:sz w:val="19"/>
+          <w:sz w:val="23"/>
         </w:rPr>
         <w:t xml:space="preserve">• Nội dung kỹ thuật: </w:t>
       </w:r>
       <w:r>
         <w:rPr>
           <w:color w:val="475569"/>
-          <w:sz w:val="19"/>
+          <w:sz w:val="23"/>
         </w:rPr>
       </w:r>
     </w:p>
     <w:p>
       <w:pPr>
-        <w:spacing w:before="20" w:after="40"/>
+        <w:spacing w:before="40" w:after="60" w:line="288" w:lineRule="auto"/>
         <w:ind w:left="792"/>
       </w:pPr>
       <w:r>
         <w:rPr>
           <w:color w:val="64748B"/>
-          <w:sz w:val="19"/>
+          <w:sz w:val="23"/>
         </w:rPr>
         <w:t xml:space="preserve">–  </w:t>
       </w:r>
       <w:r>
         <w:rPr>
           <w:color w:val="334155"/>
-          <w:sz w:val="19"/>
+          <w:sz w:val="23"/>
         </w:rPr>
         <w:t>Cài đặt `TelemetrySyncWorker` chạy ngầm định kỳ 15 phút qua Android WorkManager.</w:t>
       </w:r>
     </w:p>
     <w:p>
       <w:pPr>
-        <w:spacing w:before="20" w:after="40"/>
+        <w:spacing w:before="40" w:after="60" w:line="288" w:lineRule="auto"/>
         <w:ind w:left="792"/>
       </w:pPr>
       <w:r>
         <w:rPr>
           <w:color w:val="64748B"/>
-          <w:sz w:val="19"/>
+          <w:sz w:val="23"/>
         </w:rPr>
         <w:t xml:space="preserve">–  </w:t>
       </w:r>
       <w:r>
         <w:rPr>
           <w:color w:val="334155"/>
-          <w:sz w:val="19"/>
+          <w:sz w:val="23"/>
         </w:rPr>
         <w:t>Đọc các bản ghi từ Health Connect: Nhịp tim từng phút (`HeartRateRecord`), Số bước chân (`StepsRecord`), Nồng độ oxy (`OxygenSaturationRecord`).</w:t>
       </w:r>
     </w:p>
     <w:p>
       <w:pPr>
-        <w:spacing w:before="20" w:after="40"/>
+        <w:spacing w:before="40" w:after="60" w:line="288" w:lineRule="auto"/>
         <w:ind w:left="792"/>
       </w:pPr>
       <w:r>
         <w:rPr>
           <w:color w:val="64748B"/>
-          <w:sz w:val="19"/>
+          <w:sz w:val="23"/>
         </w:rPr>
         <w:t xml:space="preserve">–  </w:t>
       </w:r>
       <w:r>
         <w:rPr>
           <w:color w:val="334155"/>
-          <w:sz w:val="19"/>
+          <w:sz w:val="23"/>
         </w:rPr>
         <w:t>Lưu trữ vào SQLite cục bộ (`careai_local_spool.db`) ở chế độ WAL, đánh dấu cờ `Synced = 0`.</w:t>
       </w:r>
     </w:p>
     <w:p>
       <w:pPr>
-        <w:spacing w:before="20" w:after="40"/>
+        <w:spacing w:before="40" w:after="60" w:line="288" w:lineRule="auto"/>
         <w:ind w:left="792"/>
       </w:pPr>
       <w:r>
         <w:rPr>
           <w:color w:val="64748B"/>
-          <w:sz w:val="19"/>
+          <w:sz w:val="23"/>
         </w:rPr>
         <w:t xml:space="preserve">–  </w:t>
       </w:r>
       <w:r>
         <w:rPr>
           <w:color w:val="334155"/>
-          <w:sz w:val="19"/>
+          <w:sz w:val="23"/>
         </w:rPr>
         <w:t>Hàm dọn dẹp `purgeOldSyncedPackets`: Tự động xóa các bản ghi đã đồng bộ (`Synced = 1`) cũ hơn 7 ngày.</w:t>
       </w:r>
@@ -1004,12 +1004,12 @@
     <w:p>
       <w:pPr>
         <w:keepNext/>
-        <w:spacing w:before="160" w:after="40"/>
+        <w:spacing w:before="200" w:after="60"/>
         <w:ind w:left="216"/>
       </w:pPr>
       <w:r>
         <w:rPr>
-          <w:sz w:val="21"/>
+          <w:sz w:val="24"/>
         </w:rPr>
         <w:t xml:space="preserve">🔹 </w:t>
       </w:r>
@@ -1017,108 +1017,108 @@
         <w:rPr>
           <w:b/>
           <w:color w:val="0F172A"/>
-          <w:sz w:val="21"/>
+          <w:sz w:val="25"/>
         </w:rPr>
         <w:t>Nhiệm vụ 1.2 - API Batch Ingestion &amp; Hàng Đợi Bộ Nhớ Non-Blocking</w:t>
       </w:r>
     </w:p>
     <w:p>
       <w:pPr>
-        <w:spacing w:before="20" w:after="40"/>
+        <w:spacing w:before="40" w:after="60" w:line="288" w:lineRule="auto"/>
         <w:ind w:left="504"/>
       </w:pPr>
       <w:r>
         <w:rPr>
           <w:b/>
           <w:color w:val="1E293B"/>
-          <w:sz w:val="19"/>
+          <w:sz w:val="23"/>
         </w:rPr>
         <w:t xml:space="preserve">• Phân hệ: </w:t>
       </w:r>
       <w:r>
         <w:rPr>
           <w:color w:val="475569"/>
-          <w:sz w:val="19"/>
+          <w:sz w:val="23"/>
         </w:rPr>
         <w:t>`CareAI/src/CareAI.API` (C# .NET 9 LTS)</w:t>
       </w:r>
     </w:p>
     <w:p>
       <w:pPr>
-        <w:spacing w:before="20" w:after="40"/>
+        <w:spacing w:before="40" w:after="60" w:line="288" w:lineRule="auto"/>
         <w:ind w:left="504"/>
       </w:pPr>
       <w:r>
         <w:rPr>
           <w:b/>
           <w:color w:val="1E293B"/>
-          <w:sz w:val="19"/>
+          <w:sz w:val="23"/>
         </w:rPr>
         <w:t xml:space="preserve">• Nội dung kỹ thuật: </w:t>
       </w:r>
       <w:r>
         <w:rPr>
           <w:color w:val="475569"/>
-          <w:sz w:val="19"/>
+          <w:sz w:val="23"/>
         </w:rPr>
       </w:r>
     </w:p>
     <w:p>
       <w:pPr>
-        <w:spacing w:before="20" w:after="40"/>
+        <w:spacing w:before="40" w:after="60" w:line="288" w:lineRule="auto"/>
         <w:ind w:left="792"/>
       </w:pPr>
       <w:r>
         <w:rPr>
           <w:color w:val="64748B"/>
-          <w:sz w:val="19"/>
+          <w:sz w:val="23"/>
         </w:rPr>
         <w:t xml:space="preserve">–  </w:t>
       </w:r>
       <w:r>
         <w:rPr>
           <w:color w:val="334155"/>
-          <w:sz w:val="19"/>
+          <w:sz w:val="23"/>
         </w:rPr>
         <w:t>Xây dựng endpoint `POST /api/v1/telemetry/batch`: Xác thực token thiết bị qua `X-DeviceId`, giải mã mẻ tối đa 500 mẫu viễn trắc.</w:t>
       </w:r>
     </w:p>
     <w:p>
       <w:pPr>
-        <w:spacing w:before="20" w:after="40"/>
+        <w:spacing w:before="40" w:after="60" w:line="288" w:lineRule="auto"/>
         <w:ind w:left="792"/>
       </w:pPr>
       <w:r>
         <w:rPr>
           <w:color w:val="64748B"/>
-          <w:sz w:val="19"/>
+          <w:sz w:val="23"/>
         </w:rPr>
         <w:t xml:space="preserve">–  </w:t>
       </w:r>
       <w:r>
         <w:rPr>
           <w:color w:val="334155"/>
-          <w:sz w:val="19"/>
+          <w:sz w:val="23"/>
         </w:rPr>
         <w:t>Đẩy gói tin vào `System.Threading.Channels.Channel&lt;HealthMeasurementPacket&gt;` trong RAM và phản hồi ngay HTTP 202 Accepted trong `&lt; 15ms`.</w:t>
       </w:r>
     </w:p>
     <w:p>
       <w:pPr>
-        <w:spacing w:before="20" w:after="40"/>
+        <w:spacing w:before="40" w:after="60" w:line="288" w:lineRule="auto"/>
         <w:ind w:left="792"/>
       </w:pPr>
       <w:r>
         <w:rPr>
           <w:color w:val="64748B"/>
-          <w:sz w:val="19"/>
+          <w:sz w:val="23"/>
         </w:rPr>
         <w:t xml:space="preserve">–  </w:t>
       </w:r>
       <w:r>
         <w:rPr>
           <w:color w:val="334155"/>
-          <w:sz w:val="19"/>
+          <w:sz w:val="23"/>
         </w:rPr>
         <w:t>Endpoint `POST /api/v1/telemetry/heartbeat`: Cập nhật mốc thời gian `LastHeartbeat` phục vụ giám sát đường truyền.</w:t>
       </w:r>
@@ -1126,12 +1126,12 @@
     <w:p>
       <w:pPr>
         <w:keepNext/>
-        <w:spacing w:before="160" w:after="40"/>
+        <w:spacing w:before="200" w:after="60"/>
         <w:ind w:left="216"/>
       </w:pPr>
       <w:r>
         <w:rPr>
-          <w:sz w:val="21"/>
+          <w:sz w:val="24"/>
         </w:rPr>
         <w:t xml:space="preserve">🔹 </w:t>
       </w:r>
@@ -1139,148 +1139,148 @@
         <w:rPr>
           <w:b/>
           <w:color w:val="0F172A"/>
-          <w:sz w:val="21"/>
+          <w:sz w:val="25"/>
         </w:rPr>
         <w:t>Nhiệm vụ 1.3 - TelemetryBatchProcessor &amp; Mạch Cầu Dao Bảo Vệ RAM</w:t>
       </w:r>
     </w:p>
     <w:p>
       <w:pPr>
-        <w:spacing w:before="20" w:after="40"/>
+        <w:spacing w:before="40" w:after="60" w:line="288" w:lineRule="auto"/>
         <w:ind w:left="504"/>
       </w:pPr>
       <w:r>
         <w:rPr>
           <w:b/>
           <w:color w:val="1E293B"/>
-          <w:sz w:val="19"/>
+          <w:sz w:val="23"/>
         </w:rPr>
         <w:t xml:space="preserve">• Phân hệ: </w:t>
       </w:r>
       <w:r>
         <w:rPr>
           <w:color w:val="475569"/>
-          <w:sz w:val="19"/>
+          <w:sz w:val="23"/>
         </w:rPr>
         <w:t>`CareAI/src/CareAI.Infrastructure` (Background Service)</w:t>
       </w:r>
     </w:p>
     <w:p>
       <w:pPr>
-        <w:spacing w:before="20" w:after="40"/>
+        <w:spacing w:before="40" w:after="60" w:line="288" w:lineRule="auto"/>
         <w:ind w:left="504"/>
       </w:pPr>
       <w:r>
         <w:rPr>
           <w:b/>
           <w:color w:val="1E293B"/>
-          <w:sz w:val="19"/>
+          <w:sz w:val="23"/>
         </w:rPr>
         <w:t xml:space="preserve">• Nội dung kỹ thuật: </w:t>
       </w:r>
       <w:r>
         <w:rPr>
           <w:color w:val="475569"/>
-          <w:sz w:val="19"/>
+          <w:sz w:val="23"/>
         </w:rPr>
       </w:r>
     </w:p>
     <w:p>
       <w:pPr>
-        <w:spacing w:before="20" w:after="40"/>
+        <w:spacing w:before="40" w:after="60" w:line="288" w:lineRule="auto"/>
         <w:ind w:left="792"/>
       </w:pPr>
       <w:r>
         <w:rPr>
           <w:color w:val="64748B"/>
-          <w:sz w:val="19"/>
+          <w:sz w:val="23"/>
         </w:rPr>
         <w:t xml:space="preserve">–  </w:t>
       </w:r>
       <w:r>
         <w:rPr>
           <w:color w:val="334155"/>
-          <w:sz w:val="19"/>
+          <w:sz w:val="23"/>
         </w:rPr>
         <w:t>Triển khai Worker chạy nền tiêu thụ Channel theo mẻ 100 gói hoặc timeout 1.000ms.</w:t>
       </w:r>
     </w:p>
     <w:p>
       <w:pPr>
-        <w:spacing w:before="20" w:after="40"/>
+        <w:spacing w:before="40" w:after="60" w:line="288" w:lineRule="auto"/>
         <w:ind w:left="792"/>
       </w:pPr>
       <w:r>
         <w:rPr>
           <w:color w:val="64748B"/>
-          <w:sz w:val="19"/>
+          <w:sz w:val="23"/>
         </w:rPr>
         <w:t xml:space="preserve">–  </w:t>
       </w:r>
       <w:r>
         <w:rPr>
           <w:color w:val="334155"/>
-          <w:sz w:val="19"/>
+          <w:sz w:val="23"/>
         </w:rPr>
         <w:t>Khử trùng lặp Idempotency trên bảng `ProcessedTelemetryLedgers`.</w:t>
       </w:r>
     </w:p>
     <w:p>
       <w:pPr>
-        <w:spacing w:before="20" w:after="40"/>
+        <w:spacing w:before="40" w:after="60" w:line="288" w:lineRule="auto"/>
         <w:ind w:left="792"/>
       </w:pPr>
       <w:r>
         <w:rPr>
           <w:color w:val="64748B"/>
-          <w:sz w:val="19"/>
+          <w:sz w:val="23"/>
         </w:rPr>
         <w:t xml:space="preserve">–  </w:t>
       </w:r>
       <w:r>
         <w:rPr>
           <w:color w:val="334155"/>
-          <w:sz w:val="19"/>
+          <w:sz w:val="23"/>
         </w:rPr>
         <w:t>Bulk Insert dữ liệu vào bảng `HealthMeasurements` trên Azure SQL.</w:t>
       </w:r>
     </w:p>
     <w:p>
       <w:pPr>
-        <w:spacing w:before="20" w:after="40"/>
+        <w:spacing w:before="40" w:after="60" w:line="288" w:lineRule="auto"/>
         <w:ind w:left="792"/>
       </w:pPr>
       <w:r>
         <w:rPr>
           <w:color w:val="64748B"/>
-          <w:sz w:val="19"/>
+          <w:sz w:val="23"/>
         </w:rPr>
         <w:t xml:space="preserve">–  </w:t>
       </w:r>
       <w:r>
         <w:rPr>
           <w:color w:val="334155"/>
-          <w:sz w:val="19"/>
+          <w:sz w:val="23"/>
         </w:rPr>
         <w:t>Mạch Transient Retry 5 lần (khoảng cách 5s), chuyển Dead Letter Batch nếu thất bại lặp lại.</w:t>
       </w:r>
     </w:p>
     <w:p>
       <w:pPr>
-        <w:spacing w:before="20" w:after="40"/>
+        <w:spacing w:before="40" w:after="60" w:line="288" w:lineRule="auto"/>
         <w:ind w:left="792"/>
       </w:pPr>
       <w:r>
         <w:rPr>
           <w:color w:val="64748B"/>
-          <w:sz w:val="19"/>
+          <w:sz w:val="23"/>
         </w:rPr>
         <w:t xml:space="preserve">–  </w:t>
       </w:r>
       <w:r>
         <w:rPr>
           <w:color w:val="334155"/>
-          <w:sz w:val="19"/>
+          <w:sz w:val="23"/>
         </w:rPr>
         <w:t>Giới hạn ngưỡng tiêu thụ RAM dưới 700MB, chống tràn bộ nhớ trên hosting tài nguyên thấp.</w:t>
       </w:r>
@@ -1288,12 +1288,12 @@
     <w:p>
       <w:pPr>
         <w:keepNext/>
-        <w:spacing w:before="160" w:after="40"/>
+        <w:spacing w:before="200" w:after="60"/>
         <w:ind w:left="216"/>
       </w:pPr>
       <w:r>
         <w:rPr>
-          <w:sz w:val="21"/>
+          <w:sz w:val="24"/>
         </w:rPr>
         <w:t xml:space="preserve">🔹 </w:t>
       </w:r>
@@ -1301,108 +1301,108 @@
         <w:rPr>
           <w:b/>
           <w:color w:val="0F172A"/>
-          <w:sz w:val="21"/>
+          <w:sz w:val="25"/>
         </w:rPr>
         <w:t>Nhiệm vụ 1.4 - Hiển Thị Dashboard Sinh Hiệu &amp; Bản Đồ GPS</w:t>
       </w:r>
     </w:p>
     <w:p>
       <w:pPr>
-        <w:spacing w:before="20" w:after="40"/>
+        <w:spacing w:before="40" w:after="60" w:line="288" w:lineRule="auto"/>
         <w:ind w:left="504"/>
       </w:pPr>
       <w:r>
         <w:rPr>
           <w:b/>
           <w:color w:val="1E293B"/>
-          <w:sz w:val="19"/>
+          <w:sz w:val="23"/>
         </w:rPr>
         <w:t xml:space="preserve">• Phân hệ: </w:t>
       </w:r>
       <w:r>
         <w:rPr>
           <w:color w:val="475569"/>
-          <w:sz w:val="19"/>
+          <w:sz w:val="23"/>
         </w:rPr>
         <w:t>`CareAI/companion_app/lib/caregiver` (Flutter)</w:t>
       </w:r>
     </w:p>
     <w:p>
       <w:pPr>
-        <w:spacing w:before="20" w:after="40"/>
+        <w:spacing w:before="40" w:after="60" w:line="288" w:lineRule="auto"/>
         <w:ind w:left="504"/>
       </w:pPr>
       <w:r>
         <w:rPr>
           <w:b/>
           <w:color w:val="1E293B"/>
-          <w:sz w:val="19"/>
+          <w:sz w:val="23"/>
         </w:rPr>
         <w:t xml:space="preserve">• Nội dung kỹ thuật: </w:t>
       </w:r>
       <w:r>
         <w:rPr>
           <w:color w:val="475569"/>
-          <w:sz w:val="19"/>
+          <w:sz w:val="23"/>
         </w:rPr>
       </w:r>
     </w:p>
     <w:p>
       <w:pPr>
-        <w:spacing w:before="20" w:after="40"/>
+        <w:spacing w:before="40" w:after="60" w:line="288" w:lineRule="auto"/>
         <w:ind w:left="792"/>
       </w:pPr>
       <w:r>
         <w:rPr>
           <w:color w:val="64748B"/>
-          <w:sz w:val="19"/>
+          <w:sz w:val="23"/>
         </w:rPr>
         <w:t xml:space="preserve">–  </w:t>
       </w:r>
       <w:r>
         <w:rPr>
           <w:color w:val="334155"/>
-          <w:sz w:val="19"/>
+          <w:sz w:val="23"/>
         </w:rPr>
         <w:t>Màn hình Bảng điều khiển: Thẻ hiển thị nhịp tim hiện tại, mức pin, số bước chân trong ngày.</w:t>
       </w:r>
     </w:p>
     <w:p>
       <w:pPr>
-        <w:spacing w:before="20" w:after="40"/>
+        <w:spacing w:before="40" w:after="60" w:line="288" w:lineRule="auto"/>
         <w:ind w:left="792"/>
       </w:pPr>
       <w:r>
         <w:rPr>
           <w:color w:val="64748B"/>
-          <w:sz w:val="19"/>
+          <w:sz w:val="23"/>
         </w:rPr>
         <w:t xml:space="preserve">–  </w:t>
       </w:r>
       <w:r>
         <w:rPr>
           <w:color w:val="334155"/>
-          <w:sz w:val="19"/>
+          <w:sz w:val="23"/>
         </w:rPr>
         <w:t>Biểu đồ đường biến thiên nhịp tim 24 giờ (thư viện `fl_chart`) kèm chỉ số Min/Max/Avg.</w:t>
       </w:r>
     </w:p>
     <w:p>
       <w:pPr>
-        <w:spacing w:before="20" w:after="40"/>
+        <w:spacing w:before="40" w:after="60" w:line="288" w:lineRule="auto"/>
         <w:ind w:left="792"/>
       </w:pPr>
       <w:r>
         <w:rPr>
           <w:color w:val="64748B"/>
-          <w:sz w:val="19"/>
+          <w:sz w:val="23"/>
         </w:rPr>
         <w:t xml:space="preserve">–  </w:t>
       </w:r>
       <w:r>
         <w:rPr>
           <w:color w:val="334155"/>
-          <w:sz w:val="19"/>
+          <w:sz w:val="23"/>
         </w:rPr>
         <w:t>Tích hợp bản đồ GPS (`flutter_map`) hiển thị tọa độ gần nhất của cụ và thời điểm đo.</w:t>
       </w:r>
@@ -1410,12 +1410,12 @@
     <w:p>
       <w:pPr>
         <w:keepNext/>
-        <w:spacing w:before="160" w:after="40"/>
+        <w:spacing w:before="200" w:after="60"/>
         <w:ind w:left="216"/>
       </w:pPr>
       <w:r>
         <w:rPr>
-          <w:sz w:val="21"/>
+          <w:sz w:val="24"/>
         </w:rPr>
         <w:t xml:space="preserve">🔹 </w:t>
       </w:r>
@@ -1423,108 +1423,108 @@
         <w:rPr>
           <w:b/>
           <w:color w:val="0F172A"/>
-          <w:sz w:val="21"/>
+          <w:sz w:val="25"/>
         </w:rPr>
         <w:t>Nhiệm vụ 1.5 - Thuật Toán Tự Điều Chỉnh Ngưỡng Thích Nghi Theo Thời Gian</w:t>
       </w:r>
     </w:p>
     <w:p>
       <w:pPr>
-        <w:spacing w:before="20" w:after="40"/>
+        <w:spacing w:before="40" w:after="60" w:line="288" w:lineRule="auto"/>
         <w:ind w:left="504"/>
       </w:pPr>
       <w:r>
         <w:rPr>
           <w:b/>
           <w:color w:val="1E293B"/>
-          <w:sz w:val="19"/>
+          <w:sz w:val="23"/>
         </w:rPr>
         <w:t xml:space="preserve">• Phân hệ: </w:t>
       </w:r>
       <w:r>
         <w:rPr>
           <w:color w:val="475569"/>
-          <w:sz w:val="19"/>
+          <w:sz w:val="23"/>
         </w:rPr>
         <w:t>`CareAI/src/CareAI.Core` &amp; `CareAI/src/CareAI.API`</w:t>
       </w:r>
     </w:p>
     <w:p>
       <w:pPr>
-        <w:spacing w:before="20" w:after="40"/>
+        <w:spacing w:before="40" w:after="60" w:line="288" w:lineRule="auto"/>
         <w:ind w:left="504"/>
       </w:pPr>
       <w:r>
         <w:rPr>
           <w:b/>
           <w:color w:val="1E293B"/>
-          <w:sz w:val="19"/>
+          <w:sz w:val="23"/>
         </w:rPr>
         <w:t xml:space="preserve">• Nội dung kỹ thuật: </w:t>
       </w:r>
       <w:r>
         <w:rPr>
           <w:color w:val="475569"/>
-          <w:sz w:val="19"/>
+          <w:sz w:val="23"/>
         </w:rPr>
       </w:r>
     </w:p>
     <w:p>
       <w:pPr>
-        <w:spacing w:before="20" w:after="40"/>
+        <w:spacing w:before="40" w:after="60" w:line="288" w:lineRule="auto"/>
         <w:ind w:left="792"/>
       </w:pPr>
       <w:r>
         <w:rPr>
           <w:color w:val="64748B"/>
-          <w:sz w:val="19"/>
+          <w:sz w:val="23"/>
         </w:rPr>
         <w:t xml:space="preserve">–  </w:t>
       </w:r>
       <w:r>
         <w:rPr>
           <w:color w:val="334155"/>
-          <w:sz w:val="19"/>
+          <w:sz w:val="23"/>
         </w:rPr>
         <w:t>Xây dựng `AdaptiveThresholdService`: Định kỳ phân tích chuỗi nhịp tim nghỉ ngơi 14 ngày của cụ theo bách phân vị 5th và 95th.</w:t>
       </w:r>
     </w:p>
     <w:p>
       <w:pPr>
-        <w:spacing w:before="20" w:after="40"/>
+        <w:spacing w:before="40" w:after="60" w:line="288" w:lineRule="auto"/>
         <w:ind w:left="792"/>
       </w:pPr>
       <w:r>
         <w:rPr>
           <w:color w:val="64748B"/>
-          <w:sz w:val="19"/>
+          <w:sz w:val="23"/>
         </w:rPr>
         <w:t xml:space="preserve">–  </w:t>
       </w:r>
       <w:r>
         <w:rPr>
           <w:color w:val="334155"/>
-          <w:sz w:val="19"/>
+          <w:sz w:val="23"/>
         </w:rPr>
         <w:t>Tự động tính toán dải ngưỡng an toàn cá nhân hóa mới: `RecommendedMin` ($\ge 40$ bpm) và `RecommendedMax` ($\le 160$ bpm), giới hạn biên độ dịch chuyển tối đa 3 bpm/tuần.</w:t>
       </w:r>
     </w:p>
     <w:p>
       <w:pPr>
-        <w:spacing w:before="20" w:after="40"/>
+        <w:spacing w:before="40" w:after="60" w:line="288" w:lineRule="auto"/>
         <w:ind w:left="792"/>
       </w:pPr>
       <w:r>
         <w:rPr>
           <w:color w:val="64748B"/>
-          <w:sz w:val="19"/>
+          <w:sz w:val="23"/>
         </w:rPr>
         <w:t xml:space="preserve">–  </w:t>
       </w:r>
       <w:r>
         <w:rPr>
           <w:color w:val="334155"/>
-          <w:sz w:val="19"/>
+          <w:sz w:val="23"/>
         </w:rPr>
         <w:t>Endpoint `PUT /api/v1/elders/{id}/thresholds`: Cập nhật ngưỡng và làm mới tức thì `IMemoryCache` (Zero-Downtime Cache Invalidation).</w:t>
       </w:r>
@@ -1532,21 +1532,21 @@
     <w:p>
       <w:pPr>
         <w:keepNext/>
-        <w:spacing w:before="200" w:after="80"/>
+        <w:spacing w:before="240" w:after="80"/>
       </w:pPr>
       <w:r>
         <w:rPr>
           <w:rFonts w:ascii="Calibri" w:hAnsi="Calibri"/>
           <w:b/>
           <w:color w:val="0F766E"/>
-          <w:sz w:val="23"/>
+          <w:sz w:val="27"/>
         </w:rPr>
         <w:t>2.2 Tiêu Chí Nghiệm Thu Phần 1</w:t>
       </w:r>
     </w:p>
     <w:p>
       <w:pPr>
-        <w:spacing w:before="20" w:after="40"/>
+        <w:spacing w:before="40" w:after="60" w:line="288" w:lineRule="auto"/>
         <w:ind w:left="432"/>
       </w:pPr>
       <w:r>
@@ -1554,21 +1554,21 @@
           <w:rFonts w:ascii="Segoe UI Symbol" w:hAnsi="Segoe UI Symbol"/>
           <w:b/>
           <w:color w:val="10B981"/>
-          <w:sz w:val="22"/>
+          <w:sz w:val="26"/>
         </w:rPr>
         <w:t xml:space="preserve">☐  </w:t>
       </w:r>
       <w:r>
         <w:rPr>
           <w:color w:val="334155"/>
-          <w:sz w:val="19"/>
+          <w:sz w:val="23"/>
         </w:rPr>
         <w:t>Gửi mẻ 500 mẫu viễn trắc từ điện thoại lên server, phản hồi HTTP 202 Accepted trong `&lt; 15ms`.</w:t>
       </w:r>
     </w:p>
     <w:p>
       <w:pPr>
-        <w:spacing w:before="20" w:after="40"/>
+        <w:spacing w:before="40" w:after="60" w:line="288" w:lineRule="auto"/>
         <w:ind w:left="432"/>
       </w:pPr>
       <w:r>
@@ -1576,21 +1576,21 @@
           <w:rFonts w:ascii="Segoe UI Symbol" w:hAnsi="Segoe UI Symbol"/>
           <w:b/>
           <w:color w:val="10B981"/>
-          <w:sz w:val="22"/>
+          <w:sz w:val="26"/>
         </w:rPr>
         <w:t xml:space="preserve">☐  </w:t>
       </w:r>
       <w:r>
         <w:rPr>
           <w:color w:val="334155"/>
-          <w:sz w:val="19"/>
+          <w:sz w:val="23"/>
         </w:rPr>
         <w:t>Dữ liệu sinh hiệu lưu trữ bền vững vào Azure SQL, không thất thoát khi mất mạng tạm thời (thử lại thành công từ SQLite sau 7 ngày).</w:t>
       </w:r>
     </w:p>
     <w:p>
       <w:pPr>
-        <w:spacing w:before="20" w:after="40"/>
+        <w:spacing w:before="40" w:after="60" w:line="288" w:lineRule="auto"/>
         <w:ind w:left="432"/>
       </w:pPr>
       <w:r>
@@ -1598,21 +1598,21 @@
           <w:rFonts w:ascii="Segoe UI Symbol" w:hAnsi="Segoe UI Symbol"/>
           <w:b/>
           <w:color w:val="10B981"/>
-          <w:sz w:val="22"/>
+          <w:sz w:val="26"/>
         </w:rPr>
         <w:t xml:space="preserve">☐  </w:t>
       </w:r>
       <w:r>
         <w:rPr>
           <w:color w:val="334155"/>
-          <w:sz w:val="19"/>
+          <w:sz w:val="23"/>
         </w:rPr>
         <w:t>Bảng điều khiển hiển thị đầy đủ biểu đồ nhịp tim 24h và bản đồ định vị GPS.</w:t>
       </w:r>
     </w:p>
     <w:p>
       <w:pPr>
-        <w:spacing w:before="20" w:after="40"/>
+        <w:spacing w:before="40" w:after="60" w:line="288" w:lineRule="auto"/>
         <w:ind w:left="432"/>
       </w:pPr>
       <w:r>
@@ -1620,21 +1620,21 @@
           <w:rFonts w:ascii="Segoe UI Symbol" w:hAnsi="Segoe UI Symbol"/>
           <w:b/>
           <w:color w:val="10B981"/>
-          <w:sz w:val="22"/>
+          <w:sz w:val="26"/>
         </w:rPr>
         <w:t xml:space="preserve">☐  </w:t>
       </w:r>
       <w:r>
         <w:rPr>
           <w:color w:val="334155"/>
-          <w:sz w:val="19"/>
+          <w:sz w:val="23"/>
         </w:rPr>
         <w:t>Thuật toán Adaptive Thresholds tính toán chuẩn xác dải ngưỡng mới từ dữ liệu 14 ngày và làm mới Cache trong 0ms.</w:t>
       </w:r>
     </w:p>
     <w:p>
       <w:pPr>
-        <w:spacing w:before="20" w:after="40"/>
+        <w:spacing w:before="40" w:after="60" w:line="288" w:lineRule="auto"/>
         <w:ind w:left="432"/>
       </w:pPr>
       <w:r>
@@ -1642,14 +1642,14 @@
           <w:rFonts w:ascii="Segoe UI Symbol" w:hAnsi="Segoe UI Symbol"/>
           <w:b/>
           <w:color w:val="10B981"/>
-          <w:sz w:val="22"/>
+          <w:sz w:val="26"/>
         </w:rPr>
         <w:t xml:space="preserve">☐  </w:t>
       </w:r>
       <w:r>
         <w:rPr>
           <w:color w:val="334155"/>
-          <w:sz w:val="19"/>
+          <w:sz w:val="23"/>
         </w:rPr>
         <w:t>Bộ kiểm thử xUnit Fact Tests bao phủ 100% luồng Batch Ingestion và Adaptive Tuning.</w:t>
       </w:r>
@@ -1657,14 +1657,14 @@
     <w:p>
       <w:pPr>
         <w:keepNext/>
-        <w:spacing w:before="280" w:after="120"/>
+        <w:spacing w:before="320" w:after="120"/>
       </w:pPr>
       <w:r>
         <w:rPr>
           <w:rFonts w:ascii="Calibri" w:hAnsi="Calibri"/>
           <w:b/>
           <w:color w:val="1E3A8A"/>
-          <w:sz w:val="27"/>
+          <w:sz w:val="31"/>
         </w:rPr>
         <w:t>3. PHẦN 2: TRỤC TRUNG TÂM PHẢN ỨNG CẤP CỨU, ĐIỀU PHỐI QUORUM SLA 60S &amp; DẤU VẾT PHÁP Y (Phụ Trách: Tài)</w:t>
       </w:r>
@@ -1672,14 +1672,14 @@
     <w:p>
       <w:pPr>
         <w:keepNext/>
-        <w:spacing w:before="200" w:after="80"/>
+        <w:spacing w:before="240" w:after="80"/>
       </w:pPr>
       <w:r>
         <w:rPr>
           <w:rFonts w:ascii="Calibri" w:hAnsi="Calibri"/>
           <w:b/>
           <w:color w:val="0F766E"/>
-          <w:sz w:val="23"/>
+          <w:sz w:val="27"/>
         </w:rPr>
         <w:t>3.1 Danh Mục Nhiệm Vụ Cụ Thể</w:t>
       </w:r>
@@ -1687,12 +1687,12 @@
     <w:p>
       <w:pPr>
         <w:keepNext/>
-        <w:spacing w:before="160" w:after="40"/>
+        <w:spacing w:before="200" w:after="60"/>
         <w:ind w:left="216"/>
       </w:pPr>
       <w:r>
         <w:rPr>
-          <w:sz w:val="21"/>
+          <w:sz w:val="24"/>
         </w:rPr>
         <w:t xml:space="preserve">🔹 </w:t>
       </w:r>
@@ -1700,108 +1700,108 @@
         <w:rPr>
           <w:b/>
           <w:color w:val="0F172A"/>
-          <w:sz w:val="21"/>
+          <w:sz w:val="25"/>
         </w:rPr>
         <w:t>Nhiệm vụ 2.1 - Clinical Diagnostic Engine &amp; Tự Động Tái Mở Cấp Cứu</w:t>
       </w:r>
     </w:p>
     <w:p>
       <w:pPr>
-        <w:spacing w:before="20" w:after="40"/>
+        <w:spacing w:before="40" w:after="60" w:line="288" w:lineRule="auto"/>
         <w:ind w:left="504"/>
       </w:pPr>
       <w:r>
         <w:rPr>
           <w:b/>
           <w:color w:val="1E293B"/>
-          <w:sz w:val="19"/>
+          <w:sz w:val="23"/>
         </w:rPr>
         <w:t xml:space="preserve">• Phân hệ: </w:t>
       </w:r>
       <w:r>
         <w:rPr>
           <w:color w:val="475569"/>
-          <w:sz w:val="19"/>
+          <w:sz w:val="23"/>
         </w:rPr>
         <w:t>`CareAI/src/CareAI.Core` &amp; `CareAI/src/CareAI.Infrastructure`</w:t>
       </w:r>
     </w:p>
     <w:p>
       <w:pPr>
-        <w:spacing w:before="20" w:after="40"/>
+        <w:spacing w:before="40" w:after="60" w:line="288" w:lineRule="auto"/>
         <w:ind w:left="504"/>
       </w:pPr>
       <w:r>
         <w:rPr>
           <w:b/>
           <w:color w:val="1E293B"/>
-          <w:sz w:val="19"/>
+          <w:sz w:val="23"/>
         </w:rPr>
         <w:t xml:space="preserve">• Nội dung kỹ thuật: </w:t>
       </w:r>
       <w:r>
         <w:rPr>
           <w:color w:val="475569"/>
-          <w:sz w:val="19"/>
+          <w:sz w:val="23"/>
         </w:rPr>
       </w:r>
     </w:p>
     <w:p>
       <w:pPr>
-        <w:spacing w:before="20" w:after="40"/>
+        <w:spacing w:before="40" w:after="60" w:line="288" w:lineRule="auto"/>
         <w:ind w:left="792"/>
       </w:pPr>
       <w:r>
         <w:rPr>
           <w:color w:val="64748B"/>
-          <w:sz w:val="19"/>
+          <w:sz w:val="23"/>
         </w:rPr>
         <w:t xml:space="preserve">–  </w:t>
       </w:r>
       <w:r>
         <w:rPr>
           <w:color w:val="334155"/>
-          <w:sz w:val="19"/>
+          <w:sz w:val="23"/>
         </w:rPr>
         <w:t>Thẩm định thời gian thực: Bắt cơn rung thất ($\ge 180$ bpm), vô tâm thu ($\le 35$ bpm), và tăng nhịp đột ngột ($\ge 15$ bpm khi ngồi nghỉ).</w:t>
       </w:r>
     </w:p>
     <w:p>
       <w:pPr>
-        <w:spacing w:before="20" w:after="40"/>
+        <w:spacing w:before="40" w:after="60" w:line="288" w:lineRule="auto"/>
         <w:ind w:left="792"/>
       </w:pPr>
       <w:r>
         <w:rPr>
           <w:color w:val="64748B"/>
-          <w:sz w:val="19"/>
+          <w:sz w:val="23"/>
         </w:rPr>
         <w:t xml:space="preserve">–  </w:t>
       </w:r>
       <w:r>
         <w:rPr>
           <w:color w:val="334155"/>
-          <w:sz w:val="19"/>
+          <w:sz w:val="23"/>
         </w:rPr>
         <w:t>Cửa sổ khử trùng lặp (Debounce Cooldown Window 10 phút) chống kích hoạt chuông báo liên tục.</w:t>
       </w:r>
     </w:p>
     <w:p>
       <w:pPr>
-        <w:spacing w:before="20" w:after="40"/>
+        <w:spacing w:before="40" w:after="60" w:line="288" w:lineRule="auto"/>
         <w:ind w:left="792"/>
       </w:pPr>
       <w:r>
         <w:rPr>
           <w:color w:val="64748B"/>
-          <w:sz w:val="19"/>
+          <w:sz w:val="23"/>
         </w:rPr>
         <w:t xml:space="preserve">–  </w:t>
       </w:r>
       <w:r>
         <w:rPr>
           <w:color w:val="334155"/>
-          <w:sz w:val="19"/>
+          <w:sz w:val="23"/>
         </w:rPr>
         <w:t>Bất biến Re-escalation: Tự động chuyển sự cố từ `Acknowledged` quay lại `Open` và nâng mức `Critical` nếu chỉ số sinh hiệu của cụ xấu đi nguy kịch sau khi người thân đã bấm tiếp nhận.</w:t>
       </w:r>
@@ -1809,12 +1809,12 @@
     <w:p>
       <w:pPr>
         <w:keepNext/>
-        <w:spacing w:before="160" w:after="40"/>
+        <w:spacing w:before="200" w:after="60"/>
         <w:ind w:left="216"/>
       </w:pPr>
       <w:r>
         <w:rPr>
-          <w:sz w:val="21"/>
+          <w:sz w:val="24"/>
         </w:rPr>
         <w:t xml:space="preserve">🔹 </w:t>
       </w:r>
@@ -1822,128 +1822,128 @@
         <w:rPr>
           <w:b/>
           <w:color w:val="0F172A"/>
-          <w:sz w:val="21"/>
+          <w:sz w:val="25"/>
         </w:rPr>
         <w:t>Nhiệm vụ 2.2 - Multi-Device Watchdog 60s &amp; Quy Tắc Ức Chế Cấp Cứu</w:t>
       </w:r>
     </w:p>
     <w:p>
       <w:pPr>
-        <w:spacing w:before="20" w:after="40"/>
+        <w:spacing w:before="40" w:after="60" w:line="288" w:lineRule="auto"/>
         <w:ind w:left="504"/>
       </w:pPr>
       <w:r>
         <w:rPr>
           <w:b/>
           <w:color w:val="1E293B"/>
-          <w:sz w:val="19"/>
+          <w:sz w:val="23"/>
         </w:rPr>
         <w:t xml:space="preserve">• Phân hệ: </w:t>
       </w:r>
       <w:r>
         <w:rPr>
           <w:color w:val="475569"/>
-          <w:sz w:val="19"/>
+          <w:sz w:val="23"/>
         </w:rPr>
         <w:t>`CareAI/src/CareAI.Infrastructure` (Background Service)</w:t>
       </w:r>
     </w:p>
     <w:p>
       <w:pPr>
-        <w:spacing w:before="20" w:after="40"/>
+        <w:spacing w:before="40" w:after="60" w:line="288" w:lineRule="auto"/>
         <w:ind w:left="504"/>
       </w:pPr>
       <w:r>
         <w:rPr>
           <w:b/>
           <w:color w:val="1E293B"/>
-          <w:sz w:val="19"/>
+          <w:sz w:val="23"/>
         </w:rPr>
         <w:t xml:space="preserve">• Nội dung kỹ thuật: </w:t>
       </w:r>
       <w:r>
         <w:rPr>
           <w:color w:val="475569"/>
-          <w:sz w:val="19"/>
+          <w:sz w:val="23"/>
         </w:rPr>
       </w:r>
     </w:p>
     <w:p>
       <w:pPr>
-        <w:spacing w:before="20" w:after="40"/>
+        <w:spacing w:before="40" w:after="60" w:line="288" w:lineRule="auto"/>
         <w:ind w:left="792"/>
       </w:pPr>
       <w:r>
         <w:rPr>
           <w:color w:val="64748B"/>
-          <w:sz w:val="19"/>
+          <w:sz w:val="23"/>
         </w:rPr>
         <w:t xml:space="preserve">–  </w:t>
       </w:r>
       <w:r>
         <w:rPr>
           <w:color w:val="334155"/>
-          <w:sz w:val="19"/>
+          <w:sz w:val="23"/>
         </w:rPr>
         <w:t>`DeviceStaleWorker` quét trạng thái kết nối mỗi 60 giây.</w:t>
       </w:r>
     </w:p>
     <w:p>
       <w:pPr>
-        <w:spacing w:before="20" w:after="40"/>
+        <w:spacing w:before="40" w:after="60" w:line="288" w:lineRule="auto"/>
         <w:ind w:left="792"/>
       </w:pPr>
       <w:r>
         <w:rPr>
           <w:color w:val="64748B"/>
-          <w:sz w:val="19"/>
+          <w:sz w:val="23"/>
         </w:rPr>
         <w:t xml:space="preserve">–  </w:t>
       </w:r>
       <w:r>
         <w:rPr>
           <w:color w:val="334155"/>
-          <w:sz w:val="19"/>
+          <w:sz w:val="23"/>
         </w:rPr>
         <w:t>Gom nhóm theo cụ: Chỉ tạo cảnh báo mất mạng khi TẤT CẢ thiết bị của cụ mất tín hiệu quá 5 phút.</w:t>
       </w:r>
     </w:p>
     <w:p>
       <w:pPr>
-        <w:spacing w:before="20" w:after="40"/>
+        <w:spacing w:before="40" w:after="60" w:line="288" w:lineRule="auto"/>
         <w:ind w:left="792"/>
       </w:pPr>
       <w:r>
         <w:rPr>
           <w:color w:val="64748B"/>
-          <w:sz w:val="19"/>
+          <w:sz w:val="23"/>
         </w:rPr>
         <w:t xml:space="preserve">–  </w:t>
       </w:r>
       <w:r>
         <w:rPr>
           <w:color w:val="334155"/>
-          <w:sz w:val="19"/>
+          <w:sz w:val="23"/>
         </w:rPr>
         <w:t>Quy tắc ức chế cấp cứu (Emergency Suppression Rule): Nếu cụ đang có sự cố SOS hoặc Ngã, cấm tạo sự cố mất mạng rác, chỉ ghi chú bổ sung vào sự cố hiện tại.</w:t>
       </w:r>
     </w:p>
     <w:p>
       <w:pPr>
-        <w:spacing w:before="20" w:after="40"/>
+        <w:spacing w:before="40" w:after="60" w:line="288" w:lineRule="auto"/>
         <w:ind w:left="792"/>
       </w:pPr>
       <w:r>
         <w:rPr>
           <w:color w:val="64748B"/>
-          <w:sz w:val="19"/>
+          <w:sz w:val="23"/>
         </w:rPr>
         <w:t xml:space="preserve">–  </w:t>
       </w:r>
       <w:r>
         <w:rPr>
           <w:color w:val="334155"/>
-          <w:sz w:val="19"/>
+          <w:sz w:val="23"/>
         </w:rPr>
         <w:t>Tự động phục hồi đóng sự cố sang `Resolved` khi thiết bị có tín hiệu trở lại.</w:t>
       </w:r>
@@ -1951,12 +1951,12 @@
     <w:p>
       <w:pPr>
         <w:keepNext/>
-        <w:spacing w:before="160" w:after="40"/>
+        <w:spacing w:before="200" w:after="60"/>
         <w:ind w:left="216"/>
       </w:pPr>
       <w:r>
         <w:rPr>
-          <w:sz w:val="21"/>
+          <w:sz w:val="24"/>
         </w:rPr>
         <w:t xml:space="preserve">🔹 </w:t>
       </w:r>
@@ -1964,108 +1964,108 @@
         <w:rPr>
           <w:b/>
           <w:color w:val="0F172A"/>
-          <w:sz w:val="21"/>
+          <w:sz w:val="25"/>
         </w:rPr>
         <w:t>Nhiệm vụ 2.3 - Điều Phối Quorum Alerting SLA 60s &amp; Màn Hình Cứu Hộ Khẩn Cấp</w:t>
       </w:r>
     </w:p>
     <w:p>
       <w:pPr>
-        <w:spacing w:before="20" w:after="40"/>
+        <w:spacing w:before="40" w:after="60" w:line="288" w:lineRule="auto"/>
         <w:ind w:left="504"/>
       </w:pPr>
       <w:r>
         <w:rPr>
           <w:b/>
           <w:color w:val="1E293B"/>
-          <w:sz w:val="19"/>
+          <w:sz w:val="23"/>
         </w:rPr>
         <w:t xml:space="preserve">• Phân hệ: </w:t>
       </w:r>
       <w:r>
         <w:rPr>
           <w:color w:val="475569"/>
-          <w:sz w:val="19"/>
+          <w:sz w:val="23"/>
         </w:rPr>
         <w:t>`CareAI/src/CareAI.Infrastructure` &amp; `CareAI/companion_app`</w:t>
       </w:r>
     </w:p>
     <w:p>
       <w:pPr>
-        <w:spacing w:before="20" w:after="40"/>
+        <w:spacing w:before="40" w:after="60" w:line="288" w:lineRule="auto"/>
         <w:ind w:left="504"/>
       </w:pPr>
       <w:r>
         <w:rPr>
           <w:b/>
           <w:color w:val="1E293B"/>
-          <w:sz w:val="19"/>
+          <w:sz w:val="23"/>
         </w:rPr>
         <w:t xml:space="preserve">• Nội dung kỹ thuật: </w:t>
       </w:r>
       <w:r>
         <w:rPr>
           <w:color w:val="475569"/>
-          <w:sz w:val="19"/>
+          <w:sz w:val="23"/>
         </w:rPr>
       </w:r>
     </w:p>
     <w:p>
       <w:pPr>
-        <w:spacing w:before="20" w:after="40"/>
+        <w:spacing w:before="40" w:after="60" w:line="288" w:lineRule="auto"/>
         <w:ind w:left="792"/>
       </w:pPr>
       <w:r>
         <w:rPr>
           <w:color w:val="64748B"/>
-          <w:sz w:val="19"/>
+          <w:sz w:val="23"/>
         </w:rPr>
         <w:t xml:space="preserve">–  </w:t>
       </w:r>
       <w:r>
         <w:rPr>
           <w:color w:val="334155"/>
-          <w:sz w:val="19"/>
+          <w:sz w:val="23"/>
         </w:rPr>
         <w:t>Gửi thông báo đẩy High Priority qua Google FCM tới đồng thời toàn bộ người thân trong gia đình khi có sự cố `Critical`.</w:t>
       </w:r>
     </w:p>
     <w:p>
       <w:pPr>
-        <w:spacing w:before="20" w:after="40"/>
+        <w:spacing w:before="40" w:after="60" w:line="288" w:lineRule="auto"/>
         <w:ind w:left="792"/>
       </w:pPr>
       <w:r>
         <w:rPr>
           <w:color w:val="64748B"/>
-          <w:sz w:val="19"/>
+          <w:sz w:val="23"/>
         </w:rPr>
         <w:t xml:space="preserve">–  </w:t>
       </w:r>
       <w:r>
         <w:rPr>
           <w:color w:val="334155"/>
-          <w:sz w:val="19"/>
+          <w:sz w:val="23"/>
         </w:rPr>
         <w:t>Màn hình khẩn cấp trên app người thân: Phát còi hú, hiển thị sinh hiệu lúc xảy ra sự cố, vị trí GPS và địa chỉ nhà cụ.</w:t>
       </w:r>
     </w:p>
     <w:p>
       <w:pPr>
-        <w:spacing w:before="20" w:after="40"/>
+        <w:spacing w:before="40" w:after="60" w:line="288" w:lineRule="auto"/>
         <w:ind w:left="792"/>
       </w:pPr>
       <w:r>
         <w:rPr>
           <w:color w:val="64748B"/>
-          <w:sz w:val="19"/>
+          <w:sz w:val="23"/>
         </w:rPr>
         <w:t xml:space="preserve">–  </w:t>
       </w:r>
       <w:r>
         <w:rPr>
           <w:color w:val="334155"/>
-          <w:sz w:val="19"/>
+          <w:sz w:val="23"/>
         </w:rPr>
         <w:t>Nút hành động nhanh: Gọi trực tiếp cho cụ và Gọi Cấp cứu 115 một chạm.</w:t>
       </w:r>
@@ -2073,12 +2073,12 @@
     <w:p>
       <w:pPr>
         <w:keepNext/>
-        <w:spacing w:before="160" w:after="40"/>
+        <w:spacing w:before="200" w:after="60"/>
         <w:ind w:left="216"/>
       </w:pPr>
       <w:r>
         <w:rPr>
-          <w:sz w:val="21"/>
+          <w:sz w:val="24"/>
         </w:rPr>
         <w:t xml:space="preserve">🔹 </w:t>
       </w:r>
@@ -2086,108 +2086,108 @@
         <w:rPr>
           <w:b/>
           <w:color w:val="0F172A"/>
-          <w:sz w:val="21"/>
+          <w:sz w:val="25"/>
         </w:rPr>
         <w:t>Nhiệm vụ 2.4 - Quy Trình Tiếp Nhận (ACK) &amp; Giải Quyết (Resolve) Chuẩn OCC Concurrency</w:t>
       </w:r>
     </w:p>
     <w:p>
       <w:pPr>
-        <w:spacing w:before="20" w:after="40"/>
+        <w:spacing w:before="40" w:after="60" w:line="288" w:lineRule="auto"/>
         <w:ind w:left="504"/>
       </w:pPr>
       <w:r>
         <w:rPr>
           <w:b/>
           <w:color w:val="1E293B"/>
-          <w:sz w:val="19"/>
+          <w:sz w:val="23"/>
         </w:rPr>
         <w:t xml:space="preserve">• Phân hệ: </w:t>
       </w:r>
       <w:r>
         <w:rPr>
           <w:color w:val="475569"/>
-          <w:sz w:val="19"/>
+          <w:sz w:val="23"/>
         </w:rPr>
         <w:t>`CareAI/src/CareAI.API` (Controllers)</w:t>
       </w:r>
     </w:p>
     <w:p>
       <w:pPr>
-        <w:spacing w:before="20" w:after="40"/>
+        <w:spacing w:before="40" w:after="60" w:line="288" w:lineRule="auto"/>
         <w:ind w:left="504"/>
       </w:pPr>
       <w:r>
         <w:rPr>
           <w:b/>
           <w:color w:val="1E293B"/>
-          <w:sz w:val="19"/>
+          <w:sz w:val="23"/>
         </w:rPr>
         <w:t xml:space="preserve">• Nội dung kỹ thuật: </w:t>
       </w:r>
       <w:r>
         <w:rPr>
           <w:color w:val="475569"/>
-          <w:sz w:val="19"/>
+          <w:sz w:val="23"/>
         </w:rPr>
       </w:r>
     </w:p>
     <w:p>
       <w:pPr>
-        <w:spacing w:before="20" w:after="40"/>
+        <w:spacing w:before="40" w:after="60" w:line="288" w:lineRule="auto"/>
         <w:ind w:left="792"/>
       </w:pPr>
       <w:r>
         <w:rPr>
           <w:color w:val="64748B"/>
-          <w:sz w:val="19"/>
+          <w:sz w:val="23"/>
         </w:rPr>
         <w:t xml:space="preserve">–  </w:t>
       </w:r>
       <w:r>
         <w:rPr>
           <w:color w:val="334155"/>
-          <w:sz w:val="19"/>
+          <w:sz w:val="23"/>
         </w:rPr>
         <w:t>Endpoint `POST /api/v1/incidents/{id}/acknowledge`: Kiểm tra quyền BOLA, kiểm tra OCC `RowVersion`, chuyển trạng thái `Acknowledged`, tắt còi hú và thông báo cho người thân khác.</w:t>
       </w:r>
     </w:p>
     <w:p>
       <w:pPr>
-        <w:spacing w:before="20" w:after="40"/>
+        <w:spacing w:before="40" w:after="60" w:line="288" w:lineRule="auto"/>
         <w:ind w:left="792"/>
       </w:pPr>
       <w:r>
         <w:rPr>
           <w:color w:val="64748B"/>
-          <w:sz w:val="19"/>
+          <w:sz w:val="23"/>
         </w:rPr>
         <w:t xml:space="preserve">–  </w:t>
       </w:r>
       <w:r>
         <w:rPr>
           <w:color w:val="334155"/>
-          <w:sz w:val="19"/>
+          <w:sz w:val="23"/>
         </w:rPr>
         <w:t>Endpoint `POST /api/v1/incidents/{id}/resolve`: Bắt buộc nhập ghi chú lâm sàng (`ResolutionNotes`), chuyển trạng thái `Resolved`.</w:t>
       </w:r>
     </w:p>
     <w:p>
       <w:pPr>
-        <w:spacing w:before="20" w:after="40"/>
+        <w:spacing w:before="40" w:after="60" w:line="288" w:lineRule="auto"/>
         <w:ind w:left="792"/>
       </w:pPr>
       <w:r>
         <w:rPr>
           <w:color w:val="64748B"/>
-          <w:sz w:val="19"/>
+          <w:sz w:val="23"/>
         </w:rPr>
         <w:t xml:space="preserve">–  </w:t>
       </w:r>
       <w:r>
         <w:rPr>
           <w:color w:val="334155"/>
-          <w:sz w:val="19"/>
+          <w:sz w:val="23"/>
         </w:rPr>
         <w:t>Xử lý xung đột tương tranh: Nếu 2 người thân cùng bấm tiếp nhận đồng thời, người bấm sau nhận HTTP 409 Conflict kèm thông báo người trước đã tiếp nhận.</w:t>
       </w:r>
@@ -2195,12 +2195,12 @@
     <w:p>
       <w:pPr>
         <w:keepNext/>
-        <w:spacing w:before="160" w:after="40"/>
+        <w:spacing w:before="200" w:after="60"/>
         <w:ind w:left="216"/>
       </w:pPr>
       <w:r>
         <w:rPr>
-          <w:sz w:val="21"/>
+          <w:sz w:val="24"/>
         </w:rPr>
         <w:t xml:space="preserve">🔹 </w:t>
       </w:r>
@@ -2208,128 +2208,128 @@
         <w:rPr>
           <w:b/>
           <w:color w:val="0F172A"/>
-          <w:sz w:val="21"/>
+          <w:sz w:val="25"/>
         </w:rPr>
         <w:t>Nhiệm vụ 2.5 - Tra Cứu Lịch Sử Sự Cố &amp; Dấu Vết Pháp Y Bất Biến</w:t>
       </w:r>
     </w:p>
     <w:p>
       <w:pPr>
-        <w:spacing w:before="20" w:after="40"/>
+        <w:spacing w:before="40" w:after="60" w:line="288" w:lineRule="auto"/>
         <w:ind w:left="504"/>
       </w:pPr>
       <w:r>
         <w:rPr>
           <w:b/>
           <w:color w:val="1E293B"/>
-          <w:sz w:val="19"/>
+          <w:sz w:val="23"/>
         </w:rPr>
         <w:t xml:space="preserve">• Phân hệ: </w:t>
       </w:r>
       <w:r>
         <w:rPr>
           <w:color w:val="475569"/>
-          <w:sz w:val="19"/>
+          <w:sz w:val="23"/>
         </w:rPr>
         <w:t>`CareAI/src/CareAI.API` &amp; `CareAI/companion_app`</w:t>
       </w:r>
     </w:p>
     <w:p>
       <w:pPr>
-        <w:spacing w:before="20" w:after="40"/>
+        <w:spacing w:before="40" w:after="60" w:line="288" w:lineRule="auto"/>
         <w:ind w:left="504"/>
       </w:pPr>
       <w:r>
         <w:rPr>
           <w:b/>
           <w:color w:val="1E293B"/>
-          <w:sz w:val="19"/>
+          <w:sz w:val="23"/>
         </w:rPr>
         <w:t xml:space="preserve">• Nội dung kỹ thuật: </w:t>
       </w:r>
       <w:r>
         <w:rPr>
           <w:color w:val="475569"/>
-          <w:sz w:val="19"/>
+          <w:sz w:val="23"/>
         </w:rPr>
       </w:r>
     </w:p>
     <w:p>
       <w:pPr>
-        <w:spacing w:before="20" w:after="40"/>
+        <w:spacing w:before="40" w:after="60" w:line="288" w:lineRule="auto"/>
         <w:ind w:left="792"/>
       </w:pPr>
       <w:r>
         <w:rPr>
           <w:color w:val="64748B"/>
-          <w:sz w:val="19"/>
+          <w:sz w:val="23"/>
         </w:rPr>
         <w:t xml:space="preserve">–  </w:t>
       </w:r>
       <w:r>
         <w:rPr>
           <w:color w:val="334155"/>
-          <w:sz w:val="19"/>
+          <w:sz w:val="23"/>
         </w:rPr>
         <w:t>Endpoint `GET /api/v1/elders/{id}/incidents` phân trang, hỗ trợ lọc theo loại sự cố, mức độ nghiêm trọng và thời gian.</w:t>
       </w:r>
     </w:p>
     <w:p>
       <w:pPr>
-        <w:spacing w:before="20" w:after="40"/>
+        <w:spacing w:before="40" w:after="60" w:line="288" w:lineRule="auto"/>
         <w:ind w:left="792"/>
       </w:pPr>
       <w:r>
         <w:rPr>
           <w:color w:val="64748B"/>
-          <w:sz w:val="19"/>
+          <w:sz w:val="23"/>
         </w:rPr>
         <w:t xml:space="preserve">–  </w:t>
       </w:r>
       <w:r>
         <w:rPr>
           <w:color w:val="334155"/>
-          <w:sz w:val="19"/>
+          <w:sz w:val="23"/>
         </w:rPr>
         <w:t>Màn hình Timeline lịch sử sự cố: Thể hiện người tiếp nhận, thời điểm xử lý và ghi chú y tế.</w:t>
       </w:r>
     </w:p>
     <w:p>
       <w:pPr>
-        <w:spacing w:before="20" w:after="40"/>
+        <w:spacing w:before="40" w:after="60" w:line="288" w:lineRule="auto"/>
         <w:ind w:left="792"/>
       </w:pPr>
       <w:r>
         <w:rPr>
           <w:color w:val="64748B"/>
-          <w:sz w:val="19"/>
+          <w:sz w:val="23"/>
         </w:rPr>
         <w:t xml:space="preserve">–  </w:t>
       </w:r>
       <w:r>
         <w:rPr>
           <w:color w:val="334155"/>
-          <w:sz w:val="19"/>
+          <w:sz w:val="23"/>
         </w:rPr>
         <w:t>Biểu đồ chi tiết nhịp tim 15 phút trước và 15 phút sau sự cố phục vụ bác sĩ giám định hồi phục.</w:t>
       </w:r>
     </w:p>
     <w:p>
       <w:pPr>
-        <w:spacing w:before="20" w:after="40"/>
+        <w:spacing w:before="40" w:after="60" w:line="288" w:lineRule="auto"/>
         <w:ind w:left="792"/>
       </w:pPr>
       <w:r>
         <w:rPr>
           <w:color w:val="64748B"/>
-          <w:sz w:val="19"/>
+          <w:sz w:val="23"/>
         </w:rPr>
         <w:t xml:space="preserve">–  </w:t>
       </w:r>
       <w:r>
         <w:rPr>
           <w:color w:val="334155"/>
-          <w:sz w:val="19"/>
+          <w:sz w:val="23"/>
         </w:rPr>
         <w:t>Ràng buộc Append-Only trong CSDL: Cấm xóa hoặc chỉnh sửa lịch sử các sự cố đã đóng.</w:t>
       </w:r>
@@ -2337,21 +2337,21 @@
     <w:p>
       <w:pPr>
         <w:keepNext/>
-        <w:spacing w:before="200" w:after="80"/>
+        <w:spacing w:before="240" w:after="80"/>
       </w:pPr>
       <w:r>
         <w:rPr>
           <w:rFonts w:ascii="Calibri" w:hAnsi="Calibri"/>
           <w:b/>
           <w:color w:val="0F766E"/>
-          <w:sz w:val="23"/>
+          <w:sz w:val="27"/>
         </w:rPr>
         <w:t>3.2 Tiêu Chí Nghiệm Thu Phần 2</w:t>
       </w:r>
     </w:p>
     <w:p>
       <w:pPr>
-        <w:spacing w:before="20" w:after="40"/>
+        <w:spacing w:before="40" w:after="60" w:line="288" w:lineRule="auto"/>
         <w:ind w:left="432"/>
       </w:pPr>
       <w:r>
@@ -2359,21 +2359,21 @@
           <w:rFonts w:ascii="Segoe UI Symbol" w:hAnsi="Segoe UI Symbol"/>
           <w:b/>
           <w:color w:val="10B981"/>
-          <w:sz w:val="22"/>
+          <w:sz w:val="26"/>
         </w:rPr>
         <w:t xml:space="preserve">☐  </w:t>
       </w:r>
       <w:r>
         <w:rPr>
           <w:color w:val="334155"/>
-          <w:sz w:val="19"/>
+          <w:sz w:val="23"/>
         </w:rPr>
         <w:t>Kích hoạt nhịp tim giả lập 185 bpm: Kích hoạt còi hú và đẩy thông báo Quorum tới người thân trong `&lt; 3 giây`.</w:t>
       </w:r>
     </w:p>
     <w:p>
       <w:pPr>
-        <w:spacing w:before="20" w:after="40"/>
+        <w:spacing w:before="40" w:after="60" w:line="288" w:lineRule="auto"/>
         <w:ind w:left="432"/>
       </w:pPr>
       <w:r>
@@ -2381,21 +2381,21 @@
           <w:rFonts w:ascii="Segoe UI Symbol" w:hAnsi="Segoe UI Symbol"/>
           <w:b/>
           <w:color w:val="10B981"/>
-          <w:sz w:val="22"/>
+          <w:sz w:val="26"/>
         </w:rPr>
         <w:t xml:space="preserve">☐  </w:t>
       </w:r>
       <w:r>
         <w:rPr>
           <w:color w:val="334155"/>
-          <w:sz w:val="19"/>
+          <w:sz w:val="23"/>
         </w:rPr>
         <w:t>Hai người thân tiếp nhận đồng thời: OCC `RowVersion` chặn đứng lỗi Lost Update, trả về HTTP 409 cho người thứ hai.</w:t>
       </w:r>
     </w:p>
     <w:p>
       <w:pPr>
-        <w:spacing w:before="20" w:after="40"/>
+        <w:spacing w:before="40" w:after="60" w:line="288" w:lineRule="auto"/>
         <w:ind w:left="432"/>
       </w:pPr>
       <w:r>
@@ -2403,21 +2403,21 @@
           <w:rFonts w:ascii="Segoe UI Symbol" w:hAnsi="Segoe UI Symbol"/>
           <w:b/>
           <w:color w:val="10B981"/>
-          <w:sz w:val="22"/>
+          <w:sz w:val="26"/>
         </w:rPr>
         <w:t xml:space="preserve">☐  </w:t>
       </w:r>
       <w:r>
         <w:rPr>
           <w:color w:val="334155"/>
-          <w:sz w:val="19"/>
+          <w:sz w:val="23"/>
         </w:rPr>
         <w:t>Ngắt kết nối thiết bị trong lúc đang có sự cố ngã: Watchdog không sinh sự cố mất mạng rác.</w:t>
       </w:r>
     </w:p>
     <w:p>
       <w:pPr>
-        <w:spacing w:before="20" w:after="40"/>
+        <w:spacing w:before="40" w:after="60" w:line="288" w:lineRule="auto"/>
         <w:ind w:left="432"/>
       </w:pPr>
       <w:r>
@@ -2425,21 +2425,21 @@
           <w:rFonts w:ascii="Segoe UI Symbol" w:hAnsi="Segoe UI Symbol"/>
           <w:b/>
           <w:color w:val="10B981"/>
-          <w:sz w:val="22"/>
+          <w:sz w:val="26"/>
         </w:rPr>
         <w:t xml:space="preserve">☐  </w:t>
       </w:r>
       <w:r>
         <w:rPr>
           <w:color w:val="334155"/>
-          <w:sz w:val="19"/>
+          <w:sz w:val="23"/>
         </w:rPr>
         <w:t>Dấu vết người tiếp nhận và ghi chú giải quyết hiển thị đầy đủ, bất biến trên Timeline.</w:t>
       </w:r>
     </w:p>
     <w:p>
       <w:pPr>
-        <w:spacing w:before="20" w:after="40"/>
+        <w:spacing w:before="40" w:after="60" w:line="288" w:lineRule="auto"/>
         <w:ind w:left="432"/>
       </w:pPr>
       <w:r>
@@ -2447,14 +2447,14 @@
           <w:rFonts w:ascii="Segoe UI Symbol" w:hAnsi="Segoe UI Symbol"/>
           <w:b/>
           <w:color w:val="10B981"/>
-          <w:sz w:val="22"/>
+          <w:sz w:val="26"/>
         </w:rPr>
         <w:t xml:space="preserve">☐  </w:t>
       </w:r>
       <w:r>
         <w:rPr>
           <w:color w:val="334155"/>
-          <w:sz w:val="19"/>
+          <w:sz w:val="23"/>
         </w:rPr>
         <w:t>Bộ kiểm thử xUnit Fact Tests bao phủ 100% luồng Quorum, OCC Concurrency và Clinical Re-escalation.</w:t>
       </w:r>
@@ -2462,14 +2462,14 @@
     <w:p>
       <w:pPr>
         <w:keepNext/>
-        <w:spacing w:before="280" w:after="120"/>
+        <w:spacing w:before="320" w:after="120"/>
       </w:pPr>
       <w:r>
         <w:rPr>
           <w:rFonts w:ascii="Calibri" w:hAnsi="Calibri"/>
           <w:b/>
           <w:color w:val="1E3A8A"/>
-          <w:sz w:val="27"/>
+          <w:sz w:val="31"/>
         </w:rPr>
         <w:t>4. PHẦN 3: TRỤC QUẢN TRỊ NHÓM GIA ĐÌNH, MÃ MỜI 6 SỐ, PHÂN QUYỀN RBAC &amp; VÒNG ĐỜI THIẾT BỊ (Phụ Trách: Thịnh)</w:t>
       </w:r>
@@ -2477,14 +2477,14 @@
     <w:p>
       <w:pPr>
         <w:keepNext/>
-        <w:spacing w:before="200" w:after="80"/>
+        <w:spacing w:before="240" w:after="80"/>
       </w:pPr>
       <w:r>
         <w:rPr>
           <w:rFonts w:ascii="Calibri" w:hAnsi="Calibri"/>
           <w:b/>
           <w:color w:val="0F766E"/>
-          <w:sz w:val="23"/>
+          <w:sz w:val="27"/>
         </w:rPr>
         <w:t>4.1 Danh Mục Nhiệm Vụ Cụ Thể</w:t>
       </w:r>
@@ -2492,12 +2492,12 @@
     <w:p>
       <w:pPr>
         <w:keepNext/>
-        <w:spacing w:before="160" w:after="40"/>
+        <w:spacing w:before="200" w:after="60"/>
         <w:ind w:left="216"/>
       </w:pPr>
       <w:r>
         <w:rPr>
-          <w:sz w:val="21"/>
+          <w:sz w:val="24"/>
         </w:rPr>
         <w:t xml:space="preserve">🔹 </w:t>
       </w:r>
@@ -2505,108 +2505,108 @@
         <w:rPr>
           <w:b/>
           <w:color w:val="0F172A"/>
-          <w:sz w:val="21"/>
+          <w:sz w:val="25"/>
         </w:rPr>
         <w:t>Nhiệm vụ 3.1 - Xác Thực Danh Tính &amp; Khóa An Toàn Brute-Force</w:t>
       </w:r>
     </w:p>
     <w:p>
       <w:pPr>
-        <w:spacing w:before="20" w:after="40"/>
+        <w:spacing w:before="40" w:after="60" w:line="288" w:lineRule="auto"/>
         <w:ind w:left="504"/>
       </w:pPr>
       <w:r>
         <w:rPr>
           <w:b/>
           <w:color w:val="1E293B"/>
-          <w:sz w:val="19"/>
+          <w:sz w:val="23"/>
         </w:rPr>
         <w:t xml:space="preserve">• Phân hệ: </w:t>
       </w:r>
       <w:r>
         <w:rPr>
           <w:color w:val="475569"/>
-          <w:sz w:val="19"/>
+          <w:sz w:val="23"/>
         </w:rPr>
         <w:t>`CareAI/src/CareAI.API` (AuthController)</w:t>
       </w:r>
     </w:p>
     <w:p>
       <w:pPr>
-        <w:spacing w:before="20" w:after="40"/>
+        <w:spacing w:before="40" w:after="60" w:line="288" w:lineRule="auto"/>
         <w:ind w:left="504"/>
       </w:pPr>
       <w:r>
         <w:rPr>
           <w:b/>
           <w:color w:val="1E293B"/>
-          <w:sz w:val="19"/>
+          <w:sz w:val="23"/>
         </w:rPr>
         <w:t xml:space="preserve">• Nội dung kỹ thuật: </w:t>
       </w:r>
       <w:r>
         <w:rPr>
           <w:color w:val="475569"/>
-          <w:sz w:val="19"/>
+          <w:sz w:val="23"/>
         </w:rPr>
       </w:r>
     </w:p>
     <w:p>
       <w:pPr>
-        <w:spacing w:before="20" w:after="40"/>
+        <w:spacing w:before="40" w:after="60" w:line="288" w:lineRule="auto"/>
         <w:ind w:left="792"/>
       </w:pPr>
       <w:r>
         <w:rPr>
           <w:color w:val="64748B"/>
-          <w:sz w:val="19"/>
+          <w:sz w:val="23"/>
         </w:rPr>
         <w:t xml:space="preserve">–  </w:t>
       </w:r>
       <w:r>
         <w:rPr>
           <w:color w:val="334155"/>
-          <w:sz w:val="19"/>
+          <w:sz w:val="23"/>
         </w:rPr>
         <w:t>Đăng ký, đăng nhập tài khoản người thân với mật khẩu băm BCrypt (work factor 11).</w:t>
       </w:r>
     </w:p>
     <w:p>
       <w:pPr>
-        <w:spacing w:before="20" w:after="40"/>
+        <w:spacing w:before="40" w:after="60" w:line="288" w:lineRule="auto"/>
         <w:ind w:left="792"/>
       </w:pPr>
       <w:r>
         <w:rPr>
           <w:color w:val="64748B"/>
-          <w:sz w:val="19"/>
+          <w:sz w:val="23"/>
         </w:rPr>
         <w:t xml:space="preserve">–  </w:t>
       </w:r>
       <w:r>
         <w:rPr>
           <w:color w:val="334155"/>
-          <w:sz w:val="19"/>
+          <w:sz w:val="23"/>
         </w:rPr>
         <w:t>Khóa tài khoản an toàn: Đếm `FailedLoginAttempts`, nếu sai $\ge 5$ lần, khóa tài khoản 15 phút (`LockoutEnd = DateTime.UtcNow.AddMinutes(15)`), trả về HTTP 423 Locked.</w:t>
       </w:r>
     </w:p>
     <w:p>
       <w:pPr>
-        <w:spacing w:before="20" w:after="40"/>
+        <w:spacing w:before="40" w:after="60" w:line="288" w:lineRule="auto"/>
         <w:ind w:left="792"/>
       </w:pPr>
       <w:r>
         <w:rPr>
           <w:color w:val="64748B"/>
-          <w:sz w:val="19"/>
+          <w:sz w:val="23"/>
         </w:rPr>
         <w:t xml:space="preserve">–  </w:t>
       </w:r>
       <w:r>
         <w:rPr>
           <w:color w:val="334155"/>
-          <w:sz w:val="19"/>
+          <w:sz w:val="23"/>
         </w:rPr>
         <w:t>Luồng quên mật khẩu qua mã OTP 6 số gửi qua Email.</w:t>
       </w:r>
@@ -2614,12 +2614,12 @@
     <w:p>
       <w:pPr>
         <w:keepNext/>
-        <w:spacing w:before="160" w:after="40"/>
+        <w:spacing w:before="200" w:after="60"/>
         <w:ind w:left="216"/>
       </w:pPr>
       <w:r>
         <w:rPr>
-          <w:sz w:val="21"/>
+          <w:sz w:val="24"/>
         </w:rPr>
         <w:t xml:space="preserve">🔹 </w:t>
       </w:r>
@@ -2627,108 +2627,108 @@
         <w:rPr>
           <w:b/>
           <w:color w:val="0F172A"/>
-          <w:sz w:val="21"/>
+          <w:sz w:val="25"/>
         </w:rPr>
         <w:t>Nhiệm vụ 3.2 - Quản Lý Hồ Sơ Cụ &amp; Ghép Nối Thiết Bị (Mã PIN 6 Số / QR Code)</w:t>
       </w:r>
     </w:p>
     <w:p>
       <w:pPr>
-        <w:spacing w:before="20" w:after="40"/>
+        <w:spacing w:before="40" w:after="60" w:line="288" w:lineRule="auto"/>
         <w:ind w:left="504"/>
       </w:pPr>
       <w:r>
         <w:rPr>
           <w:b/>
           <w:color w:val="1E293B"/>
-          <w:sz w:val="19"/>
+          <w:sz w:val="23"/>
         </w:rPr>
         <w:t xml:space="preserve">• Phân hệ: </w:t>
       </w:r>
       <w:r>
         <w:rPr>
           <w:color w:val="475569"/>
-          <w:sz w:val="19"/>
+          <w:sz w:val="23"/>
         </w:rPr>
         <w:t>`CareAI/src/CareAI.API` &amp; `CareAI/companion_app`</w:t>
       </w:r>
     </w:p>
     <w:p>
       <w:pPr>
-        <w:spacing w:before="20" w:after="40"/>
+        <w:spacing w:before="40" w:after="60" w:line="288" w:lineRule="auto"/>
         <w:ind w:left="504"/>
       </w:pPr>
       <w:r>
         <w:rPr>
           <w:b/>
           <w:color w:val="1E293B"/>
-          <w:sz w:val="19"/>
+          <w:sz w:val="23"/>
         </w:rPr>
         <w:t xml:space="preserve">• Nội dung kỹ thuật: </w:t>
       </w:r>
       <w:r>
         <w:rPr>
           <w:color w:val="475569"/>
-          <w:sz w:val="19"/>
+          <w:sz w:val="23"/>
         </w:rPr>
       </w:r>
     </w:p>
     <w:p>
       <w:pPr>
-        <w:spacing w:before="20" w:after="40"/>
+        <w:spacing w:before="40" w:after="60" w:line="288" w:lineRule="auto"/>
         <w:ind w:left="792"/>
       </w:pPr>
       <w:r>
         <w:rPr>
           <w:color w:val="64748B"/>
-          <w:sz w:val="19"/>
+          <w:sz w:val="23"/>
         </w:rPr>
         <w:t xml:space="preserve">–  </w:t>
       </w:r>
       <w:r>
         <w:rPr>
           <w:color w:val="334155"/>
-          <w:sz w:val="19"/>
+          <w:sz w:val="23"/>
         </w:rPr>
         <w:t>Màn hình tạo và chỉnh sửa hồ sơ người cao tuổi: Họ tên, năm sinh, bệnh lý nền, số điện thoại khẩn cấp.</w:t>
       </w:r>
     </w:p>
     <w:p>
       <w:pPr>
-        <w:spacing w:before="20" w:after="40"/>
+        <w:spacing w:before="40" w:after="60" w:line="288" w:lineRule="auto"/>
         <w:ind w:left="792"/>
       </w:pPr>
       <w:r>
         <w:rPr>
           <w:color w:val="64748B"/>
-          <w:sz w:val="19"/>
+          <w:sz w:val="23"/>
         </w:rPr>
         <w:t xml:space="preserve">–  </w:t>
       </w:r>
       <w:r>
         <w:rPr>
           <w:color w:val="334155"/>
-          <w:sz w:val="19"/>
+          <w:sz w:val="23"/>
         </w:rPr>
         <w:t>Endpoint `POST /api/v1/elders/{id}/pairing-code`: Sinh mã PIN 6 số dùng 1 lần (TTL 15 phút, lưu băm SHA-256 trong CSDL).</w:t>
       </w:r>
     </w:p>
     <w:p>
       <w:pPr>
-        <w:spacing w:before="20" w:after="40"/>
+        <w:spacing w:before="40" w:after="60" w:line="288" w:lineRule="auto"/>
         <w:ind w:left="792"/>
       </w:pPr>
       <w:r>
         <w:rPr>
           <w:color w:val="64748B"/>
-          <w:sz w:val="19"/>
+          <w:sz w:val="23"/>
         </w:rPr>
         <w:t xml:space="preserve">–  </w:t>
       </w:r>
       <w:r>
         <w:rPr>
           <w:color w:val="334155"/>
-          <w:sz w:val="19"/>
+          <w:sz w:val="23"/>
         </w:rPr>
         <w:t>Tạo mã QR Code trên app người thân để camera điện thoại của cụ quét tự động ghép nối trong 1 chạm.</w:t>
       </w:r>
@@ -2736,12 +2736,12 @@
     <w:p>
       <w:pPr>
         <w:keepNext/>
-        <w:spacing w:before="160" w:after="40"/>
+        <w:spacing w:before="200" w:after="60"/>
         <w:ind w:left="216"/>
       </w:pPr>
       <w:r>
         <w:rPr>
-          <w:sz w:val="21"/>
+          <w:sz w:val="24"/>
         </w:rPr>
         <w:t xml:space="preserve">🔹 </w:t>
       </w:r>
@@ -2749,108 +2749,108 @@
         <w:rPr>
           <w:b/>
           <w:color w:val="0F172A"/>
-          <w:sz w:val="21"/>
+          <w:sz w:val="25"/>
         </w:rPr>
         <w:t>Nhiệm vụ 3.3 - Quản Trị Nhóm Gia Đình &amp; Mã Mời 24 Giờ</w:t>
       </w:r>
     </w:p>
     <w:p>
       <w:pPr>
-        <w:spacing w:before="20" w:after="40"/>
+        <w:spacing w:before="40" w:after="60" w:line="288" w:lineRule="auto"/>
         <w:ind w:left="504"/>
       </w:pPr>
       <w:r>
         <w:rPr>
           <w:b/>
           <w:color w:val="1E293B"/>
-          <w:sz w:val="19"/>
+          <w:sz w:val="23"/>
         </w:rPr>
         <w:t xml:space="preserve">• Phân hệ: </w:t>
       </w:r>
       <w:r>
         <w:rPr>
           <w:color w:val="475569"/>
-          <w:sz w:val="19"/>
+          <w:sz w:val="23"/>
         </w:rPr>
         <w:t>`CareAI/src/CareAI.API` &amp; `CareAI/companion_app`</w:t>
       </w:r>
     </w:p>
     <w:p>
       <w:pPr>
-        <w:spacing w:before="20" w:after="40"/>
+        <w:spacing w:before="40" w:after="60" w:line="288" w:lineRule="auto"/>
         <w:ind w:left="504"/>
       </w:pPr>
       <w:r>
         <w:rPr>
           <w:b/>
           <w:color w:val="1E293B"/>
-          <w:sz w:val="19"/>
+          <w:sz w:val="23"/>
         </w:rPr>
         <w:t xml:space="preserve">• Nội dung kỹ thuật: </w:t>
       </w:r>
       <w:r>
         <w:rPr>
           <w:color w:val="475569"/>
-          <w:sz w:val="19"/>
+          <w:sz w:val="23"/>
         </w:rPr>
       </w:r>
     </w:p>
     <w:p>
       <w:pPr>
-        <w:spacing w:before="20" w:after="40"/>
+        <w:spacing w:before="40" w:after="60" w:line="288" w:lineRule="auto"/>
         <w:ind w:left="792"/>
       </w:pPr>
       <w:r>
         <w:rPr>
           <w:color w:val="64748B"/>
-          <w:sz w:val="19"/>
+          <w:sz w:val="23"/>
         </w:rPr>
         <w:t xml:space="preserve">–  </w:t>
       </w:r>
       <w:r>
         <w:rPr>
           <w:color w:val="334155"/>
-          <w:sz w:val="19"/>
+          <w:sz w:val="23"/>
         </w:rPr>
         <w:t>Endpoint `POST /api/v1/elders/{id}/invitations`: Sinh mã mời gia đình 6 ký tự viết hoa (TTL 24 giờ).</w:t>
       </w:r>
     </w:p>
     <w:p>
       <w:pPr>
-        <w:spacing w:before="20" w:after="40"/>
+        <w:spacing w:before="40" w:after="60" w:line="288" w:lineRule="auto"/>
         <w:ind w:left="792"/>
       </w:pPr>
       <w:r>
         <w:rPr>
           <w:color w:val="64748B"/>
-          <w:sz w:val="19"/>
+          <w:sz w:val="23"/>
         </w:rPr>
         <w:t xml:space="preserve">–  </w:t>
       </w:r>
       <w:r>
         <w:rPr>
           <w:color w:val="334155"/>
-          <w:sz w:val="19"/>
+          <w:sz w:val="23"/>
         </w:rPr>
         <w:t>Endpoint `POST /api/v1/invitations/accept`: Người thân phụ nhập mã mời để tham gia nhóm chăm sóc cụ.</w:t>
       </w:r>
     </w:p>
     <w:p>
       <w:pPr>
-        <w:spacing w:before="20" w:after="40"/>
+        <w:spacing w:before="40" w:after="60" w:line="288" w:lineRule="auto"/>
         <w:ind w:left="792"/>
       </w:pPr>
       <w:r>
         <w:rPr>
           <w:color w:val="64748B"/>
-          <w:sz w:val="19"/>
+          <w:sz w:val="23"/>
         </w:rPr>
         <w:t xml:space="preserve">–  </w:t>
       </w:r>
       <w:r>
         <w:rPr>
           <w:color w:val="334155"/>
-          <w:sz w:val="19"/>
+          <w:sz w:val="23"/>
         </w:rPr>
         <w:t>Màn hình Quản lý thành viên gia đình: Danh sách người chăm sóc, vai trò và nút thu hồi quyền theo dõi.</w:t>
       </w:r>
@@ -2858,12 +2858,12 @@
     <w:p>
       <w:pPr>
         <w:keepNext/>
-        <w:spacing w:before="160" w:after="40"/>
+        <w:spacing w:before="200" w:after="60"/>
         <w:ind w:left="216"/>
       </w:pPr>
       <w:r>
         <w:rPr>
-          <w:sz w:val="21"/>
+          <w:sz w:val="24"/>
         </w:rPr>
         <w:t xml:space="preserve">🔹 </w:t>
       </w:r>
@@ -2871,108 +2871,108 @@
         <w:rPr>
           <w:b/>
           <w:color w:val="0F172A"/>
-          <w:sz w:val="21"/>
+          <w:sz w:val="25"/>
         </w:rPr>
         <w:t>Nhiệm vụ 3.4 - Thực Thi Ma Trận Phân Quyền RBAC Nghiêm Ngặt</w:t>
       </w:r>
     </w:p>
     <w:p>
       <w:pPr>
-        <w:spacing w:before="20" w:after="40"/>
+        <w:spacing w:before="40" w:after="60" w:line="288" w:lineRule="auto"/>
         <w:ind w:left="504"/>
       </w:pPr>
       <w:r>
         <w:rPr>
           <w:b/>
           <w:color w:val="1E293B"/>
-          <w:sz w:val="19"/>
+          <w:sz w:val="23"/>
         </w:rPr>
         <w:t xml:space="preserve">• Phân hệ: </w:t>
       </w:r>
       <w:r>
         <w:rPr>
           <w:color w:val="475569"/>
-          <w:sz w:val="19"/>
+          <w:sz w:val="23"/>
         </w:rPr>
         <w:t>`CareAI/src/CareAI.Core` (Authorization Policies)</w:t>
       </w:r>
     </w:p>
     <w:p>
       <w:pPr>
-        <w:spacing w:before="20" w:after="40"/>
+        <w:spacing w:before="40" w:after="60" w:line="288" w:lineRule="auto"/>
         <w:ind w:left="504"/>
       </w:pPr>
       <w:r>
         <w:rPr>
           <w:b/>
           <w:color w:val="1E293B"/>
-          <w:sz w:val="19"/>
+          <w:sz w:val="23"/>
         </w:rPr>
         <w:t xml:space="preserve">• Nội dung kỹ thuật: </w:t>
       </w:r>
       <w:r>
         <w:rPr>
           <w:color w:val="475569"/>
-          <w:sz w:val="19"/>
+          <w:sz w:val="23"/>
         </w:rPr>
       </w:r>
     </w:p>
     <w:p>
       <w:pPr>
-        <w:spacing w:before="20" w:after="40"/>
+        <w:spacing w:before="40" w:after="60" w:line="288" w:lineRule="auto"/>
         <w:ind w:left="792"/>
       </w:pPr>
       <w:r>
         <w:rPr>
           <w:color w:val="64748B"/>
-          <w:sz w:val="19"/>
+          <w:sz w:val="23"/>
         </w:rPr>
         <w:t xml:space="preserve">–  </w:t>
       </w:r>
       <w:r>
         <w:rPr>
           <w:color w:val="334155"/>
-          <w:sz w:val="19"/>
+          <w:sz w:val="23"/>
         </w:rPr>
         <w:t>**Người thân chính (Primary Caregiver)**: Toàn quyền cấu hình ngưỡng y tế, mời/xóa thành viên, hủy thiết bị, xóa hồ sơ và tiếp nhận/đóng sự cố.</w:t>
       </w:r>
     </w:p>
     <w:p>
       <w:pPr>
-        <w:spacing w:before="20" w:after="40"/>
+        <w:spacing w:before="40" w:after="60" w:line="288" w:lineRule="auto"/>
         <w:ind w:left="792"/>
       </w:pPr>
       <w:r>
         <w:rPr>
           <w:color w:val="64748B"/>
-          <w:sz w:val="19"/>
+          <w:sz w:val="23"/>
         </w:rPr>
         <w:t xml:space="preserve">–  </w:t>
       </w:r>
       <w:r>
         <w:rPr>
           <w:color w:val="334155"/>
-          <w:sz w:val="19"/>
+          <w:sz w:val="23"/>
         </w:rPr>
         <w:t>**Người thân phụ (Secondary Caregiver)**: Quyền xem Dashboard, nhận còi hú FCM, tiếp nhận ACK, gọi cứu trợ; TUYỆT ĐỐI KHÔNG có quyền thay đổi ngưỡng, không có quyền xóa thành viên khác hoặc hủy thiết bị.</w:t>
       </w:r>
     </w:p>
     <w:p>
       <w:pPr>
-        <w:spacing w:before="20" w:after="40"/>
+        <w:spacing w:before="40" w:after="60" w:line="288" w:lineRule="auto"/>
         <w:ind w:left="792"/>
       </w:pPr>
       <w:r>
         <w:rPr>
           <w:color w:val="64748B"/>
-          <w:sz w:val="19"/>
+          <w:sz w:val="23"/>
         </w:rPr>
         <w:t xml:space="preserve">–  </w:t>
       </w:r>
       <w:r>
         <w:rPr>
           <w:color w:val="334155"/>
-          <w:sz w:val="19"/>
+          <w:sz w:val="23"/>
         </w:rPr>
         <w:t>Chặn đứng mọi hành vi leo quyền với mã lỗi HTTP 403 Forbidden.</w:t>
       </w:r>
@@ -2980,12 +2980,12 @@
     <w:p>
       <w:pPr>
         <w:keepNext/>
-        <w:spacing w:before="160" w:after="40"/>
+        <w:spacing w:before="200" w:after="60"/>
         <w:ind w:left="216"/>
       </w:pPr>
       <w:r>
         <w:rPr>
-          <w:sz w:val="21"/>
+          <w:sz w:val="24"/>
         </w:rPr>
         <w:t xml:space="preserve">🔹 </w:t>
       </w:r>
@@ -2993,88 +2993,88 @@
         <w:rPr>
           <w:b/>
           <w:color w:val="0F172A"/>
-          <w:sz w:val="21"/>
+          <w:sz w:val="25"/>
         </w:rPr>
         <w:t>Nhiệm vụ 3.5 - Vòng Đời Thiết Bị &amp; Quyền Xóa Dữ Liệu An Toàn</w:t>
       </w:r>
     </w:p>
     <w:p>
       <w:pPr>
-        <w:spacing w:before="20" w:after="40"/>
+        <w:spacing w:before="40" w:after="60" w:line="288" w:lineRule="auto"/>
         <w:ind w:left="504"/>
       </w:pPr>
       <w:r>
         <w:rPr>
           <w:b/>
           <w:color w:val="1E293B"/>
-          <w:sz w:val="19"/>
+          <w:sz w:val="23"/>
         </w:rPr>
         <w:t xml:space="preserve">• Phân hệ: </w:t>
       </w:r>
       <w:r>
         <w:rPr>
           <w:color w:val="475569"/>
-          <w:sz w:val="19"/>
+          <w:sz w:val="23"/>
         </w:rPr>
         <w:t>`CareAI/src/CareAI.API` &amp; `CareAI/companion_app`</w:t>
       </w:r>
     </w:p>
     <w:p>
       <w:pPr>
-        <w:spacing w:before="20" w:after="40"/>
+        <w:spacing w:before="40" w:after="60" w:line="288" w:lineRule="auto"/>
         <w:ind w:left="504"/>
       </w:pPr>
       <w:r>
         <w:rPr>
           <w:b/>
           <w:color w:val="1E293B"/>
-          <w:sz w:val="19"/>
+          <w:sz w:val="23"/>
         </w:rPr>
         <w:t xml:space="preserve">• Nội dung kỹ thuật: </w:t>
       </w:r>
       <w:r>
         <w:rPr>
           <w:color w:val="475569"/>
-          <w:sz w:val="19"/>
+          <w:sz w:val="23"/>
         </w:rPr>
       </w:r>
     </w:p>
     <w:p>
       <w:pPr>
-        <w:spacing w:before="20" w:after="40"/>
+        <w:spacing w:before="40" w:after="60" w:line="288" w:lineRule="auto"/>
         <w:ind w:left="792"/>
       </w:pPr>
       <w:r>
         <w:rPr>
           <w:color w:val="64748B"/>
-          <w:sz w:val="19"/>
+          <w:sz w:val="23"/>
         </w:rPr>
         <w:t xml:space="preserve">–  </w:t>
       </w:r>
       <w:r>
         <w:rPr>
           <w:color w:val="334155"/>
-          <w:sz w:val="19"/>
+          <w:sz w:val="23"/>
         </w:rPr>
         <w:t>Endpoint `POST /api/v1/devices/{id}/unpair`: Hủy ghép nối, đưa token vào danh sách đen (Blacklist) trong Cache, gửi silent push `WIPE_DEVICE_CREDENTIALS` yêu cầu điện thoại cụ xóa Keystore và trở về màn hình chờ ghép nối.</w:t>
       </w:r>
     </w:p>
     <w:p>
       <w:pPr>
-        <w:spacing w:before="20" w:after="40"/>
+        <w:spacing w:before="40" w:after="60" w:line="288" w:lineRule="auto"/>
         <w:ind w:left="792"/>
       </w:pPr>
       <w:r>
         <w:rPr>
           <w:color w:val="64748B"/>
-          <w:sz w:val="19"/>
+          <w:sz w:val="23"/>
         </w:rPr>
         <w:t xml:space="preserve">–  </w:t>
       </w:r>
       <w:r>
         <w:rPr>
           <w:color w:val="334155"/>
-          <w:sz w:val="19"/>
+          <w:sz w:val="23"/>
         </w:rPr>
         <w:t>Endpoint `DELETE /api/v1/elders/{id}`: Xác thực mật khẩu cấp 2 của Người thân chính. Xóa mềm hồ sơ cụ (`IsDeleted = true`), hủy liên kết thiết bị và ẩn danh hóa toàn bộ dữ liệu sinh hiệu (PII Removal).</w:t>
       </w:r>
@@ -3082,21 +3082,21 @@
     <w:p>
       <w:pPr>
         <w:keepNext/>
-        <w:spacing w:before="200" w:after="80"/>
+        <w:spacing w:before="240" w:after="80"/>
       </w:pPr>
       <w:r>
         <w:rPr>
           <w:rFonts w:ascii="Calibri" w:hAnsi="Calibri"/>
           <w:b/>
           <w:color w:val="0F766E"/>
-          <w:sz w:val="23"/>
+          <w:sz w:val="27"/>
         </w:rPr>
         <w:t>4.2 Tiêu Chí Nghiệm Thu Phần 3</w:t>
       </w:r>
     </w:p>
     <w:p>
       <w:pPr>
-        <w:spacing w:before="20" w:after="40"/>
+        <w:spacing w:before="40" w:after="60" w:line="288" w:lineRule="auto"/>
         <w:ind w:left="432"/>
       </w:pPr>
       <w:r>
@@ -3104,21 +3104,21 @@
           <w:rFonts w:ascii="Segoe UI Symbol" w:hAnsi="Segoe UI Symbol"/>
           <w:b/>
           <w:color w:val="10B981"/>
-          <w:sz w:val="22"/>
+          <w:sz w:val="26"/>
         </w:rPr>
         <w:t xml:space="preserve">☐  </w:t>
       </w:r>
       <w:r>
         <w:rPr>
           <w:color w:val="334155"/>
-          <w:sz w:val="19"/>
+          <w:sz w:val="23"/>
         </w:rPr>
         <w:t>Nhập sai mật khẩu 5 lần: Tài khoản bị khóa 15 phút, trả về HTTP 423 Locked.</w:t>
       </w:r>
     </w:p>
     <w:p>
       <w:pPr>
-        <w:spacing w:before="20" w:after="40"/>
+        <w:spacing w:before="40" w:after="60" w:line="288" w:lineRule="auto"/>
         <w:ind w:left="432"/>
       </w:pPr>
       <w:r>
@@ -3126,21 +3126,21 @@
           <w:rFonts w:ascii="Segoe UI Symbol" w:hAnsi="Segoe UI Symbol"/>
           <w:b/>
           <w:color w:val="10B981"/>
-          <w:sz w:val="22"/>
+          <w:sz w:val="26"/>
         </w:rPr>
         <w:t xml:space="preserve">☐  </w:t>
       </w:r>
       <w:r>
         <w:rPr>
           <w:color w:val="334155"/>
-          <w:sz w:val="19"/>
+          <w:sz w:val="23"/>
         </w:rPr>
         <w:t>Ghép nối thiết bị qua mã PIN 6 số hoặc quét mã QR thành công trong 15 phút; mã hết hạn bị từ chối với HTTP 400.</w:t>
       </w:r>
     </w:p>
     <w:p>
       <w:pPr>
-        <w:spacing w:before="20" w:after="40"/>
+        <w:spacing w:before="40" w:after="60" w:line="288" w:lineRule="auto"/>
         <w:ind w:left="432"/>
       </w:pPr>
       <w:r>
@@ -3148,21 +3148,21 @@
           <w:rFonts w:ascii="Segoe UI Symbol" w:hAnsi="Segoe UI Symbol"/>
           <w:b/>
           <w:color w:val="10B981"/>
-          <w:sz w:val="22"/>
+          <w:sz w:val="26"/>
         </w:rPr>
         <w:t xml:space="preserve">☐  </w:t>
       </w:r>
       <w:r>
         <w:rPr>
           <w:color w:val="334155"/>
-          <w:sz w:val="19"/>
+          <w:sz w:val="23"/>
         </w:rPr>
         <w:t>Mời thành viên mới qua mã 6 ký tự thành công; tài khoản người thân phụ bị chặn HTTP 403 khi cố thay đổi cấu hình y tế.</w:t>
       </w:r>
     </w:p>
     <w:p>
       <w:pPr>
-        <w:spacing w:before="20" w:after="40"/>
+        <w:spacing w:before="40" w:after="60" w:line="288" w:lineRule="auto"/>
         <w:ind w:left="432"/>
       </w:pPr>
       <w:r>
@@ -3170,21 +3170,21 @@
           <w:rFonts w:ascii="Segoe UI Symbol" w:hAnsi="Segoe UI Symbol"/>
           <w:b/>
           <w:color w:val="10B981"/>
-          <w:sz w:val="22"/>
+          <w:sz w:val="26"/>
         </w:rPr>
         <w:t xml:space="preserve">☐  </w:t>
       </w:r>
       <w:r>
         <w:rPr>
           <w:color w:val="334155"/>
-          <w:sz w:val="19"/>
+          <w:sz w:val="23"/>
         </w:rPr>
         <w:t>Hủy ghép nối từ xa: Điện thoại của cụ tự động xóa sạch thông tin đăng nhập và quay về màn hình ban đầu.</w:t>
       </w:r>
     </w:p>
     <w:p>
       <w:pPr>
-        <w:spacing w:before="20" w:after="40"/>
+        <w:spacing w:before="40" w:after="60" w:line="288" w:lineRule="auto"/>
         <w:ind w:left="432"/>
       </w:pPr>
       <w:r>
@@ -3192,14 +3192,14 @@
           <w:rFonts w:ascii="Segoe UI Symbol" w:hAnsi="Segoe UI Symbol"/>
           <w:b/>
           <w:color w:val="10B981"/>
-          <w:sz w:val="22"/>
+          <w:sz w:val="26"/>
         </w:rPr>
         <w:t xml:space="preserve">☐  </w:t>
       </w:r>
       <w:r>
         <w:rPr>
           <w:color w:val="334155"/>
-          <w:sz w:val="19"/>
+          <w:sz w:val="23"/>
         </w:rPr>
         <w:t>Bộ kiểm thử xUnit Fact Tests bao phủ 100% luồng RBAC, Brute-force Lockout và Data Anonymization.</w:t>
       </w:r>
@@ -3207,14 +3207,14 @@
     <w:p>
       <w:pPr>
         <w:keepNext/>
-        <w:spacing w:before="280" w:after="120"/>
+        <w:spacing w:before="320" w:after="120"/>
       </w:pPr>
       <w:r>
         <w:rPr>
           <w:rFonts w:ascii="Calibri" w:hAnsi="Calibri"/>
           <w:b/>
           <w:color w:val="1E3A8A"/>
-          <w:sz w:val="27"/>
+          <w:sz w:val="31"/>
         </w:rPr>
         <w:t>5. PHẦN 4: TRỤC TRÍ TUỆ NHÂN TẠO (AI/ML) PHÂN TÍCH DỊ BIỆT SINH HOẠT &amp; BÁO CÁO Y TẾ TUẦN (Phụ Trách: Hiển)</w:t>
       </w:r>
@@ -3222,14 +3222,14 @@
     <w:p>
       <w:pPr>
         <w:keepNext/>
-        <w:spacing w:before="200" w:after="80"/>
+        <w:spacing w:before="240" w:after="80"/>
       </w:pPr>
       <w:r>
         <w:rPr>
           <w:rFonts w:ascii="Calibri" w:hAnsi="Calibri"/>
           <w:b/>
           <w:color w:val="0F766E"/>
-          <w:sz w:val="23"/>
+          <w:sz w:val="27"/>
         </w:rPr>
         <w:t>5.1 Danh Mục Nhiệm Vụ Cụ Thể</w:t>
       </w:r>
@@ -3237,12 +3237,12 @@
     <w:p>
       <w:pPr>
         <w:keepNext/>
-        <w:spacing w:before="160" w:after="40"/>
+        <w:spacing w:before="200" w:after="60"/>
         <w:ind w:left="216"/>
       </w:pPr>
       <w:r>
         <w:rPr>
-          <w:sz w:val="21"/>
+          <w:sz w:val="24"/>
         </w:rPr>
         <w:t xml:space="preserve">🔹 </w:t>
       </w:r>
@@ -3250,168 +3250,168 @@
         <w:rPr>
           <w:b/>
           <w:color w:val="0F172A"/>
-          <w:sz w:val="21"/>
+          <w:sz w:val="25"/>
         </w:rPr>
         <w:t>Nhiệm vụ 4.1 - Mô Hình Học Máy Chuỗi Thời Gian ML.NET In-Process</w:t>
       </w:r>
     </w:p>
     <w:p>
       <w:pPr>
-        <w:spacing w:before="20" w:after="40"/>
+        <w:spacing w:before="40" w:after="60" w:line="288" w:lineRule="auto"/>
         <w:ind w:left="504"/>
       </w:pPr>
       <w:r>
         <w:rPr>
           <w:b/>
           <w:color w:val="1E293B"/>
-          <w:sz w:val="19"/>
+          <w:sz w:val="23"/>
         </w:rPr>
         <w:t xml:space="preserve">• Phân hệ: </w:t>
       </w:r>
       <w:r>
         <w:rPr>
           <w:color w:val="475569"/>
-          <w:sz w:val="19"/>
+          <w:sz w:val="23"/>
         </w:rPr>
         <w:t>`CareAI/src/CareAI.Infrastructure` (Background Service)</w:t>
       </w:r>
     </w:p>
     <w:p>
       <w:pPr>
-        <w:spacing w:before="20" w:after="40"/>
+        <w:spacing w:before="40" w:after="60" w:line="288" w:lineRule="auto"/>
         <w:ind w:left="504"/>
       </w:pPr>
       <w:r>
         <w:rPr>
           <w:b/>
           <w:color w:val="1E293B"/>
-          <w:sz w:val="19"/>
+          <w:sz w:val="23"/>
         </w:rPr>
         <w:t xml:space="preserve">• Nội dung kỹ thuật: </w:t>
       </w:r>
       <w:r>
         <w:rPr>
           <w:color w:val="475569"/>
-          <w:sz w:val="19"/>
+          <w:sz w:val="23"/>
         </w:rPr>
       </w:r>
     </w:p>
     <w:p>
       <w:pPr>
-        <w:spacing w:before="20" w:after="40"/>
+        <w:spacing w:before="40" w:after="60" w:line="288" w:lineRule="auto"/>
         <w:ind w:left="792"/>
       </w:pPr>
       <w:r>
         <w:rPr>
           <w:color w:val="64748B"/>
-          <w:sz w:val="19"/>
+          <w:sz w:val="23"/>
         </w:rPr>
         <w:t xml:space="preserve">–  </w:t>
       </w:r>
       <w:r>
         <w:rPr>
           <w:color w:val="334155"/>
-          <w:sz w:val="19"/>
+          <w:sz w:val="23"/>
         </w:rPr>
         <w:t>Tích hợp thư viện `Microsoft.ML` (phiên bản ổn định LTS) chạy trực tiếp trong tiến trình Kestrel.</w:t>
       </w:r>
     </w:p>
     <w:p>
       <w:pPr>
-        <w:spacing w:before="20" w:after="40"/>
+        <w:spacing w:before="40" w:after="60" w:line="288" w:lineRule="auto"/>
         <w:ind w:left="792"/>
       </w:pPr>
       <w:r>
         <w:rPr>
           <w:color w:val="64748B"/>
-          <w:sz w:val="19"/>
+          <w:sz w:val="23"/>
         </w:rPr>
         <w:t xml:space="preserve">–  </w:t>
       </w:r>
       <w:r>
         <w:rPr>
           <w:color w:val="334155"/>
-          <w:sz w:val="19"/>
+          <w:sz w:val="23"/>
         </w:rPr>
         <w:t>`AnomalyDetectionWorker` chạy ngầm định kỳ lúc 02:00 sáng hàng ngày.</w:t>
       </w:r>
     </w:p>
     <w:p>
       <w:pPr>
-        <w:spacing w:before="20" w:after="40"/>
+        <w:spacing w:before="40" w:after="60" w:line="288" w:lineRule="auto"/>
         <w:ind w:left="792"/>
       </w:pPr>
       <w:r>
         <w:rPr>
           <w:color w:val="64748B"/>
-          <w:sz w:val="19"/>
+          <w:sz w:val="23"/>
         </w:rPr>
         <w:t xml:space="preserve">–  </w:t>
       </w:r>
       <w:r>
         <w:rPr>
           <w:color w:val="334155"/>
-          <w:sz w:val="19"/>
+          <w:sz w:val="23"/>
         </w:rPr>
         <w:t>Ứng dụng thuật toán `IidSpikeDetector` hoặc SSA trên chuỗi dữ liệu 14 ngày của cụ:</w:t>
       </w:r>
     </w:p>
     <w:p>
       <w:pPr>
-        <w:spacing w:before="20" w:after="40"/>
+        <w:spacing w:before="40" w:after="60" w:line="288" w:lineRule="auto"/>
         <w:ind w:left="792"/>
       </w:pPr>
       <w:r>
         <w:rPr>
           <w:color w:val="64748B"/>
-          <w:sz w:val="19"/>
+          <w:sz w:val="23"/>
         </w:rPr>
         <w:t xml:space="preserve">• </w:t>
       </w:r>
       <w:r>
         <w:rPr>
           <w:color w:val="334155"/>
-          <w:sz w:val="19"/>
+          <w:sz w:val="23"/>
         </w:rPr>
         <w:t>Phát hiện điểm đột biến nhịp tim ban đêm (nhịp tim khi ngủ cao bất thường so với thói quen của chính cụ).</w:t>
       </w:r>
     </w:p>
     <w:p>
       <w:pPr>
-        <w:spacing w:before="20" w:after="40"/>
+        <w:spacing w:before="40" w:after="60" w:line="288" w:lineRule="auto"/>
         <w:ind w:left="792"/>
       </w:pPr>
       <w:r>
         <w:rPr>
           <w:color w:val="64748B"/>
-          <w:sz w:val="19"/>
+          <w:sz w:val="23"/>
         </w:rPr>
         <w:t xml:space="preserve">• </w:t>
       </w:r>
       <w:r>
         <w:rPr>
           <w:color w:val="334155"/>
-          <w:sz w:val="19"/>
+          <w:sz w:val="23"/>
         </w:rPr>
         <w:t>Phát hiện bất thường vận động (số bước chân buổi sáng bằng 0 so với mức vận động thường ngày).</w:t>
       </w:r>
     </w:p>
     <w:p>
       <w:pPr>
-        <w:spacing w:before="20" w:after="40"/>
+        <w:spacing w:before="40" w:after="60" w:line="288" w:lineRule="auto"/>
         <w:ind w:left="792"/>
       </w:pPr>
       <w:r>
         <w:rPr>
           <w:color w:val="64748B"/>
-          <w:sz w:val="19"/>
+          <w:sz w:val="23"/>
         </w:rPr>
         <w:t xml:space="preserve">–  </w:t>
       </w:r>
       <w:r>
         <w:rPr>
           <w:color w:val="334155"/>
-          <w:sz w:val="19"/>
+          <w:sz w:val="23"/>
         </w:rPr>
         <w:t>Lưu bản ghi nhận định vào bảng `HealthInsights` trên Azure SQL.</w:t>
       </w:r>
@@ -3419,12 +3419,12 @@
     <w:p>
       <w:pPr>
         <w:keepNext/>
-        <w:spacing w:before="160" w:after="40"/>
+        <w:spacing w:before="200" w:after="60"/>
         <w:ind w:left="216"/>
       </w:pPr>
       <w:r>
         <w:rPr>
-          <w:sz w:val="21"/>
+          <w:sz w:val="24"/>
         </w:rPr>
         <w:t xml:space="preserve">🔹 </w:t>
       </w:r>
@@ -3432,88 +3432,88 @@
         <w:rPr>
           <w:b/>
           <w:color w:val="0F172A"/>
-          <w:sz w:val="21"/>
+          <w:sz w:val="25"/>
         </w:rPr>
         <w:t>Nhiệm vụ 4.2 - Bộ Khử Dữ Liệu Định Danh Cá Nhân (Zero-PII Engine)</w:t>
       </w:r>
     </w:p>
     <w:p>
       <w:pPr>
-        <w:spacing w:before="20" w:after="40"/>
+        <w:spacing w:before="40" w:after="60" w:line="288" w:lineRule="auto"/>
         <w:ind w:left="504"/>
       </w:pPr>
       <w:r>
         <w:rPr>
           <w:b/>
           <w:color w:val="1E293B"/>
-          <w:sz w:val="19"/>
+          <w:sz w:val="23"/>
         </w:rPr>
         <w:t xml:space="preserve">• Phân hệ: </w:t>
       </w:r>
       <w:r>
         <w:rPr>
           <w:color w:val="475569"/>
-          <w:sz w:val="19"/>
+          <w:sz w:val="23"/>
         </w:rPr>
         <w:t>`CareAI/src/CareAI.Infrastructure`</w:t>
       </w:r>
     </w:p>
     <w:p>
       <w:pPr>
-        <w:spacing w:before="20" w:after="40"/>
+        <w:spacing w:before="40" w:after="60" w:line="288" w:lineRule="auto"/>
         <w:ind w:left="504"/>
       </w:pPr>
       <w:r>
         <w:rPr>
           <w:b/>
           <w:color w:val="1E293B"/>
-          <w:sz w:val="19"/>
+          <w:sz w:val="23"/>
         </w:rPr>
         <w:t xml:space="preserve">• Nội dung kỹ thuật: </w:t>
       </w:r>
       <w:r>
         <w:rPr>
           <w:color w:val="475569"/>
-          <w:sz w:val="19"/>
+          <w:sz w:val="23"/>
         </w:rPr>
       </w:r>
     </w:p>
     <w:p>
       <w:pPr>
-        <w:spacing w:before="20" w:after="40"/>
+        <w:spacing w:before="40" w:after="60" w:line="288" w:lineRule="auto"/>
         <w:ind w:left="792"/>
       </w:pPr>
       <w:r>
         <w:rPr>
           <w:color w:val="64748B"/>
-          <w:sz w:val="19"/>
+          <w:sz w:val="23"/>
         </w:rPr>
         <w:t xml:space="preserve">–  </w:t>
       </w:r>
       <w:r>
         <w:rPr>
           <w:color w:val="334155"/>
-          <w:sz w:val="19"/>
+          <w:sz w:val="23"/>
         </w:rPr>
         <w:t>Xây dựng `PiiAnonymizerService`: Chuyển đổi dữ liệu thống kê tuần thành các chỉ số thống kê trừu tượng (nhịp tim trung bình, bước chân, số lần cảnh báo).</w:t>
       </w:r>
     </w:p>
     <w:p>
       <w:pPr>
-        <w:spacing w:before="20" w:after="40"/>
+        <w:spacing w:before="40" w:after="60" w:line="288" w:lineRule="auto"/>
         <w:ind w:left="792"/>
       </w:pPr>
       <w:r>
         <w:rPr>
           <w:color w:val="64748B"/>
-          <w:sz w:val="19"/>
+          <w:sz w:val="23"/>
         </w:rPr>
         <w:t xml:space="preserve">–  </w:t>
       </w:r>
       <w:r>
         <w:rPr>
           <w:color w:val="334155"/>
-          <w:sz w:val="19"/>
+          <w:sz w:val="23"/>
         </w:rPr>
         <w:t>Loại bỏ 100% thông tin tên thật, số điện thoại, địa chỉ nhà trước khi gửi dữ liệu ra bên ngoài.</w:t>
       </w:r>
@@ -3521,12 +3521,12 @@
     <w:p>
       <w:pPr>
         <w:keepNext/>
-        <w:spacing w:before="160" w:after="40"/>
+        <w:spacing w:before="200" w:after="60"/>
         <w:ind w:left="216"/>
       </w:pPr>
       <w:r>
         <w:rPr>
-          <w:sz w:val="21"/>
+          <w:sz w:val="24"/>
         </w:rPr>
         <w:t xml:space="preserve">🔹 </w:t>
       </w:r>
@@ -3534,108 +3534,108 @@
         <w:rPr>
           <w:b/>
           <w:color w:val="0F172A"/>
-          <w:sz w:val="21"/>
+          <w:sz w:val="25"/>
         </w:rPr>
         <w:t>Nhiệm vụ 4.3 - WeeklyReportWorker &amp; Tích Hợp GenAI Y Tế</w:t>
       </w:r>
     </w:p>
     <w:p>
       <w:pPr>
-        <w:spacing w:before="20" w:after="40"/>
+        <w:spacing w:before="40" w:after="60" w:line="288" w:lineRule="auto"/>
         <w:ind w:left="504"/>
       </w:pPr>
       <w:r>
         <w:rPr>
           <w:b/>
           <w:color w:val="1E293B"/>
-          <w:sz w:val="19"/>
+          <w:sz w:val="23"/>
         </w:rPr>
         <w:t xml:space="preserve">• Phân hệ: </w:t>
       </w:r>
       <w:r>
         <w:rPr>
           <w:color w:val="475569"/>
-          <w:sz w:val="19"/>
+          <w:sz w:val="23"/>
         </w:rPr>
         <w:t>`CareAI/src/CareAI.Infrastructure`</w:t>
       </w:r>
     </w:p>
     <w:p>
       <w:pPr>
-        <w:spacing w:before="20" w:after="40"/>
+        <w:spacing w:before="40" w:after="60" w:line="288" w:lineRule="auto"/>
         <w:ind w:left="504"/>
       </w:pPr>
       <w:r>
         <w:rPr>
           <w:b/>
           <w:color w:val="1E293B"/>
-          <w:sz w:val="19"/>
+          <w:sz w:val="23"/>
         </w:rPr>
         <w:t xml:space="preserve">• Nội dung kỹ thuật: </w:t>
       </w:r>
       <w:r>
         <w:rPr>
           <w:color w:val="475569"/>
-          <w:sz w:val="19"/>
+          <w:sz w:val="23"/>
         </w:rPr>
       </w:r>
     </w:p>
     <w:p>
       <w:pPr>
-        <w:spacing w:before="20" w:after="40"/>
+        <w:spacing w:before="40" w:after="60" w:line="288" w:lineRule="auto"/>
         <w:ind w:left="792"/>
       </w:pPr>
       <w:r>
         <w:rPr>
           <w:color w:val="64748B"/>
-          <w:sz w:val="19"/>
+          <w:sz w:val="23"/>
         </w:rPr>
         <w:t xml:space="preserve">–  </w:t>
       </w:r>
       <w:r>
         <w:rPr>
           <w:color w:val="334155"/>
-          <w:sz w:val="19"/>
+          <w:sz w:val="23"/>
         </w:rPr>
         <w:t>`WeeklyReportWorker` tự động kích hoạt lúc 07:00 sáng Chủ Nhật hàng tuần.</w:t>
       </w:r>
     </w:p>
     <w:p>
       <w:pPr>
-        <w:spacing w:before="20" w:after="40"/>
+        <w:spacing w:before="40" w:after="60" w:line="288" w:lineRule="auto"/>
         <w:ind w:left="792"/>
       </w:pPr>
       <w:r>
         <w:rPr>
           <w:color w:val="64748B"/>
-          <w:sz w:val="19"/>
+          <w:sz w:val="23"/>
         </w:rPr>
         <w:t xml:space="preserve">–  </w:t>
       </w:r>
       <w:r>
         <w:rPr>
           <w:color w:val="334155"/>
-          <w:sz w:val="19"/>
+          <w:sz w:val="23"/>
         </w:rPr>
         <w:t>Cấu trúc Prompt y tế chuẩn hóa gửi tới API Google Gemini qua HttpClient (timeout 5s).</w:t>
       </w:r>
     </w:p>
     <w:p>
       <w:pPr>
-        <w:spacing w:before="20" w:after="40"/>
+        <w:spacing w:before="40" w:after="60" w:line="288" w:lineRule="auto"/>
         <w:ind w:left="792"/>
       </w:pPr>
       <w:r>
         <w:rPr>
           <w:color w:val="64748B"/>
-          <w:sz w:val="19"/>
+          <w:sz w:val="23"/>
         </w:rPr>
         <w:t xml:space="preserve">–  </w:t>
       </w:r>
       <w:r>
         <w:rPr>
           <w:color w:val="334155"/>
-          <w:sz w:val="19"/>
+          <w:sz w:val="23"/>
         </w:rPr>
         <w:t>Chuyển đổi số liệu thống kê thành văn bản tổng kết tuần ân cần, dễ hiểu bằng tiếng Việt: (1) Tổng quan sức khỏe tuần; (2) Điểm tích cực &amp; Cần lưu ý; (3) Lời khuyên sinh hoạt tuần tới cho gia đình.</w:t>
       </w:r>
@@ -3643,12 +3643,12 @@
     <w:p>
       <w:pPr>
         <w:keepNext/>
-        <w:spacing w:before="160" w:after="40"/>
+        <w:spacing w:before="200" w:after="60"/>
         <w:ind w:left="216"/>
       </w:pPr>
       <w:r>
         <w:rPr>
-          <w:sz w:val="21"/>
+          <w:sz w:val="24"/>
         </w:rPr>
         <w:t xml:space="preserve">🔹 </w:t>
       </w:r>
@@ -3656,128 +3656,128 @@
         <w:rPr>
           <w:b/>
           <w:color w:val="0F172A"/>
-          <w:sz w:val="21"/>
+          <w:sz w:val="25"/>
         </w:rPr>
         <w:t>Nhiệm vụ 4.4 - Cơ Chế Dự Phòng Tất Định Bắt Buộc (Deterministic Fallback Engine)</w:t>
       </w:r>
     </w:p>
     <w:p>
       <w:pPr>
-        <w:spacing w:before="20" w:after="40"/>
+        <w:spacing w:before="40" w:after="60" w:line="288" w:lineRule="auto"/>
         <w:ind w:left="504"/>
       </w:pPr>
       <w:r>
         <w:rPr>
           <w:b/>
           <w:color w:val="1E293B"/>
-          <w:sz w:val="19"/>
+          <w:sz w:val="23"/>
         </w:rPr>
         <w:t xml:space="preserve">• Phân hệ: </w:t>
       </w:r>
       <w:r>
         <w:rPr>
           <w:color w:val="475569"/>
-          <w:sz w:val="19"/>
+          <w:sz w:val="23"/>
         </w:rPr>
         <w:t>`CareAI/src/CareAI.Infrastructure`</w:t>
       </w:r>
     </w:p>
     <w:p>
       <w:pPr>
-        <w:spacing w:before="20" w:after="40"/>
+        <w:spacing w:before="40" w:after="60" w:line="288" w:lineRule="auto"/>
         <w:ind w:left="504"/>
       </w:pPr>
       <w:r>
         <w:rPr>
           <w:b/>
           <w:color w:val="1E293B"/>
-          <w:sz w:val="19"/>
+          <w:sz w:val="23"/>
         </w:rPr>
         <w:t xml:space="preserve">• Nội dung kỹ thuật: </w:t>
       </w:r>
       <w:r>
         <w:rPr>
           <w:color w:val="475569"/>
-          <w:sz w:val="19"/>
+          <w:sz w:val="23"/>
         </w:rPr>
       </w:r>
     </w:p>
     <w:p>
       <w:pPr>
-        <w:spacing w:before="20" w:after="40"/>
+        <w:spacing w:before="40" w:after="60" w:line="288" w:lineRule="auto"/>
         <w:ind w:left="792"/>
       </w:pPr>
       <w:r>
         <w:rPr>
           <w:color w:val="64748B"/>
-          <w:sz w:val="19"/>
+          <w:sz w:val="23"/>
         </w:rPr>
         <w:t xml:space="preserve">–  </w:t>
       </w:r>
       <w:r>
         <w:rPr>
           <w:color w:val="334155"/>
-          <w:sz w:val="19"/>
+          <w:sz w:val="23"/>
         </w:rPr>
         <w:t>Xây dựng `RuleBasedWeeklyReportFallbackEngine`.</w:t>
       </w:r>
     </w:p>
     <w:p>
       <w:pPr>
-        <w:spacing w:before="20" w:after="40"/>
+        <w:spacing w:before="40" w:after="60" w:line="288" w:lineRule="auto"/>
         <w:ind w:left="792"/>
       </w:pPr>
       <w:r>
         <w:rPr>
           <w:color w:val="64748B"/>
-          <w:sz w:val="19"/>
+          <w:sz w:val="23"/>
         </w:rPr>
         <w:t xml:space="preserve">–  </w:t>
       </w:r>
       <w:r>
         <w:rPr>
           <w:color w:val="334155"/>
-          <w:sz w:val="19"/>
+          <w:sz w:val="23"/>
         </w:rPr>
         <w:t>Khi gọi API AI bên ngoài gặp lỗi (mất mạng, timeout, hoặc HTTP 429 Too Many Requests): Tự động chuyển sang bộ ghép chuỗi mẫu câu quy tắc nội bộ dựa trên số liệu thực tế trong 0ms.</w:t>
       </w:r>
     </w:p>
     <w:p>
       <w:pPr>
-        <w:spacing w:before="20" w:after="40"/>
+        <w:spacing w:before="40" w:after="60" w:line="288" w:lineRule="auto"/>
         <w:ind w:left="792"/>
       </w:pPr>
       <w:r>
         <w:rPr>
           <w:color w:val="64748B"/>
-          <w:sz w:val="19"/>
+          <w:sz w:val="23"/>
         </w:rPr>
         <w:t xml:space="preserve">–  </w:t>
       </w:r>
       <w:r>
         <w:rPr>
           <w:color w:val="334155"/>
-          <w:sz w:val="19"/>
+          <w:sz w:val="23"/>
         </w:rPr>
         <w:t>Đảm bảo báo cáo tuần không bao giờ bị gián đoạn hay thất bại.</w:t>
       </w:r>
     </w:p>
     <w:p>
       <w:pPr>
-        <w:spacing w:before="20" w:after="40"/>
+        <w:spacing w:before="40" w:after="60" w:line="288" w:lineRule="auto"/>
         <w:ind w:left="792"/>
       </w:pPr>
       <w:r>
         <w:rPr>
           <w:color w:val="64748B"/>
-          <w:sz w:val="19"/>
+          <w:sz w:val="23"/>
         </w:rPr>
         <w:t xml:space="preserve">–  </w:t>
       </w:r>
       <w:r>
         <w:rPr>
           <w:color w:val="334155"/>
-          <w:sz w:val="19"/>
+          <w:sz w:val="23"/>
         </w:rPr>
         <w:t>Lưu trữ báo cáo vào bảng `WeeklyHealthReports` trên Azure SQL và gửi thông báo đẩy tới người thân.</w:t>
       </w:r>
@@ -3785,12 +3785,12 @@
     <w:p>
       <w:pPr>
         <w:keepNext/>
-        <w:spacing w:before="160" w:after="40"/>
+        <w:spacing w:before="200" w:after="60"/>
         <w:ind w:left="216"/>
       </w:pPr>
       <w:r>
         <w:rPr>
-          <w:sz w:val="21"/>
+          <w:sz w:val="24"/>
         </w:rPr>
         <w:t xml:space="preserve">🔹 </w:t>
       </w:r>
@@ -3798,88 +3798,88 @@
         <w:rPr>
           <w:b/>
           <w:color w:val="0F172A"/>
-          <w:sz w:val="21"/>
+          <w:sz w:val="25"/>
         </w:rPr>
         <w:t>Nhiệm vụ 4.5 - Màn Hình "Góc Sức Khỏe AI" &amp; Lịch Sử Báo Cáo Tuần</w:t>
       </w:r>
     </w:p>
     <w:p>
       <w:pPr>
-        <w:spacing w:before="20" w:after="40"/>
+        <w:spacing w:before="40" w:after="60" w:line="288" w:lineRule="auto"/>
         <w:ind w:left="504"/>
       </w:pPr>
       <w:r>
         <w:rPr>
           <w:b/>
           <w:color w:val="1E293B"/>
-          <w:sz w:val="19"/>
+          <w:sz w:val="23"/>
         </w:rPr>
         <w:t xml:space="preserve">• Phân hệ: </w:t>
       </w:r>
       <w:r>
         <w:rPr>
           <w:color w:val="475569"/>
-          <w:sz w:val="19"/>
+          <w:sz w:val="23"/>
         </w:rPr>
         <w:t>`CareAI/companion_app/lib/caregiver` (Flutter)</w:t>
       </w:r>
     </w:p>
     <w:p>
       <w:pPr>
-        <w:spacing w:before="20" w:after="40"/>
+        <w:spacing w:before="40" w:after="60" w:line="288" w:lineRule="auto"/>
         <w:ind w:left="504"/>
       </w:pPr>
       <w:r>
         <w:rPr>
           <w:b/>
           <w:color w:val="1E293B"/>
-          <w:sz w:val="19"/>
+          <w:sz w:val="23"/>
         </w:rPr>
         <w:t xml:space="preserve">• Nội dung kỹ thuật: </w:t>
       </w:r>
       <w:r>
         <w:rPr>
           <w:color w:val="475569"/>
-          <w:sz w:val="19"/>
+          <w:sz w:val="23"/>
         </w:rPr>
       </w:r>
     </w:p>
     <w:p>
       <w:pPr>
-        <w:spacing w:before="20" w:after="40"/>
+        <w:spacing w:before="40" w:after="60" w:line="288" w:lineRule="auto"/>
         <w:ind w:left="792"/>
       </w:pPr>
       <w:r>
         <w:rPr>
           <w:color w:val="64748B"/>
-          <w:sz w:val="19"/>
+          <w:sz w:val="23"/>
         </w:rPr>
         <w:t xml:space="preserve">–  </w:t>
       </w:r>
       <w:r>
         <w:rPr>
           <w:color w:val="334155"/>
-          <w:sz w:val="19"/>
+          <w:sz w:val="23"/>
         </w:rPr>
         <w:t>Tab "Góc Sức Khỏe AI": Hiển thị các thẻ nhận định thông minh kèm lời khuyên hỏi thăm sức khỏe cụ.</w:t>
       </w:r>
     </w:p>
     <w:p>
       <w:pPr>
-        <w:spacing w:before="20" w:after="40"/>
+        <w:spacing w:before="40" w:after="60" w:line="288" w:lineRule="auto"/>
         <w:ind w:left="792"/>
       </w:pPr>
       <w:r>
         <w:rPr>
           <w:color w:val="64748B"/>
-          <w:sz w:val="19"/>
+          <w:sz w:val="23"/>
         </w:rPr>
         <w:t xml:space="preserve">–  </w:t>
       </w:r>
       <w:r>
         <w:rPr>
           <w:color w:val="334155"/>
-          <w:sz w:val="19"/>
+          <w:sz w:val="23"/>
         </w:rPr>
         <w:t>Màn hình xem Báo cáo Tuần chi tiết với tính năng cuộn xem lịch sử các tuần trước.</w:t>
       </w:r>
@@ -3887,21 +3887,21 @@
     <w:p>
       <w:pPr>
         <w:keepNext/>
-        <w:spacing w:before="200" w:after="80"/>
+        <w:spacing w:before="240" w:after="80"/>
       </w:pPr>
       <w:r>
         <w:rPr>
           <w:rFonts w:ascii="Calibri" w:hAnsi="Calibri"/>
           <w:b/>
           <w:color w:val="0F766E"/>
-          <w:sz w:val="23"/>
+          <w:sz w:val="27"/>
         </w:rPr>
         <w:t>5.2 Tiêu Chí Nghiệm Thu Phần 4</w:t>
       </w:r>
     </w:p>
     <w:p>
       <w:pPr>
-        <w:spacing w:before="20" w:after="40"/>
+        <w:spacing w:before="40" w:after="60" w:line="288" w:lineRule="auto"/>
         <w:ind w:left="432"/>
       </w:pPr>
       <w:r>
@@ -3909,21 +3909,21 @@
           <w:rFonts w:ascii="Segoe UI Symbol" w:hAnsi="Segoe UI Symbol"/>
           <w:b/>
           <w:color w:val="10B981"/>
-          <w:sz w:val="22"/>
+          <w:sz w:val="26"/>
         </w:rPr>
         <w:t xml:space="preserve">☐  </w:t>
       </w:r>
       <w:r>
         <w:rPr>
           <w:color w:val="334155"/>
-          <w:sz w:val="19"/>
+          <w:sz w:val="23"/>
         </w:rPr>
         <w:t>Mô hình ML.NET chạy in-process, phát hiện chính xác điểm đột biến nhịp tim ẩn ban đêm và ghi bản ghi `HealthInsight` thành công.</w:t>
       </w:r>
     </w:p>
     <w:p>
       <w:pPr>
-        <w:spacing w:before="20" w:after="40"/>
+        <w:spacing w:before="40" w:after="60" w:line="288" w:lineRule="auto"/>
         <w:ind w:left="432"/>
       </w:pPr>
       <w:r>
@@ -3931,21 +3931,21 @@
           <w:rFonts w:ascii="Segoe UI Symbol" w:hAnsi="Segoe UI Symbol"/>
           <w:b/>
           <w:color w:val="10B981"/>
-          <w:sz w:val="22"/>
+          <w:sz w:val="26"/>
         </w:rPr>
         <w:t xml:space="preserve">☐  </w:t>
       </w:r>
       <w:r>
         <w:rPr>
           <w:color w:val="334155"/>
-          <w:sz w:val="19"/>
+          <w:sz w:val="23"/>
         </w:rPr>
         <w:t>Chuỗi payload gửi tới API AI hoàn toàn sạch thông tin PII.</w:t>
       </w:r>
     </w:p>
     <w:p>
       <w:pPr>
-        <w:spacing w:before="20" w:after="40"/>
+        <w:spacing w:before="40" w:after="60" w:line="288" w:lineRule="auto"/>
         <w:ind w:left="432"/>
       </w:pPr>
       <w:r>
@@ -3953,21 +3953,21 @@
           <w:rFonts w:ascii="Segoe UI Symbol" w:hAnsi="Segoe UI Symbol"/>
           <w:b/>
           <w:color w:val="10B981"/>
-          <w:sz w:val="22"/>
+          <w:sz w:val="26"/>
         </w:rPr>
         <w:t xml:space="preserve">☐  </w:t>
       </w:r>
       <w:r>
         <w:rPr>
           <w:color w:val="334155"/>
-          <w:sz w:val="19"/>
+          <w:sz w:val="23"/>
         </w:rPr>
         <w:t>Thử nghiệm ngắt mạng API AI: Hệ thống tự động kích hoạt Deterministic Fallback Engine trong 0ms, sinh báo cáo tiếng Việt chuẩn xác mà không văng lỗi.</w:t>
       </w:r>
     </w:p>
     <w:p>
       <w:pPr>
-        <w:spacing w:before="20" w:after="40"/>
+        <w:spacing w:before="40" w:after="60" w:line="288" w:lineRule="auto"/>
         <w:ind w:left="432"/>
       </w:pPr>
       <w:r>
@@ -3975,21 +3975,21 @@
           <w:rFonts w:ascii="Segoe UI Symbol" w:hAnsi="Segoe UI Symbol"/>
           <w:b/>
           <w:color w:val="10B981"/>
-          <w:sz w:val="22"/>
+          <w:sz w:val="26"/>
         </w:rPr>
         <w:t xml:space="preserve">☐  </w:t>
       </w:r>
       <w:r>
         <w:rPr>
           <w:color w:val="334155"/>
-          <w:sz w:val="19"/>
+          <w:sz w:val="23"/>
         </w:rPr>
         <w:t>Giao diện Góc Sức Khỏe AI và Báo Cáo Tuần hiển thị trực quan trên ứng dụng di động.</w:t>
       </w:r>
     </w:p>
     <w:p>
       <w:pPr>
-        <w:spacing w:before="20" w:after="40"/>
+        <w:spacing w:before="40" w:after="60" w:line="288" w:lineRule="auto"/>
         <w:ind w:left="432"/>
       </w:pPr>
       <w:r>
@@ -3997,14 +3997,14 @@
           <w:rFonts w:ascii="Segoe UI Symbol" w:hAnsi="Segoe UI Symbol"/>
           <w:b/>
           <w:color w:val="10B981"/>
-          <w:sz w:val="22"/>
+          <w:sz w:val="26"/>
         </w:rPr>
         <w:t xml:space="preserve">☐  </w:t>
       </w:r>
       <w:r>
         <w:rPr>
           <w:color w:val="334155"/>
-          <w:sz w:val="19"/>
+          <w:sz w:val="23"/>
         </w:rPr>
         <w:t>Bộ kiểm thử xUnit Fact Tests bao phủ 100% luồng ML.NET Spike Detection, PII Anonymizer và Deterministic Fallback.</w:t>
       </w:r>
@@ -4012,27 +4012,28 @@
     <w:p>
       <w:pPr>
         <w:keepNext/>
-        <w:spacing w:before="280" w:after="120"/>
+        <w:spacing w:before="320" w:after="120"/>
       </w:pPr>
       <w:r>
         <w:rPr>
           <w:rFonts w:ascii="Calibri" w:hAnsi="Calibri"/>
           <w:b/>
           <w:color w:val="1E3A8A"/>
-          <w:sz w:val="27"/>
+          <w:sz w:val="31"/>
         </w:rPr>
         <w:t>6. BỘ BẤT BIẾN KỸ THUẬT BẮT BUỘC (INVARIANT RULES)</w:t>
       </w:r>
     </w:p>
     <w:p>
       <w:pPr>
-        <w:spacing w:before="80" w:after="60"/>
+        <w:spacing w:before="100" w:after="80" w:line="288" w:lineRule="auto"/>
         <w:ind w:left="288"/>
       </w:pPr>
       <w:r>
         <w:rPr>
           <w:b/>
           <w:color w:val="1E3A8A"/>
+          <w:sz w:val="24"/>
         </w:rPr>
         <w:t xml:space="preserve">1. </w:t>
       </w:r>
@@ -4040,25 +4041,27 @@
         <w:rPr>
           <w:b/>
           <w:color w:val="1E3A8A"/>
+          <w:sz w:val="24"/>
         </w:rPr>
         <w:t xml:space="preserve">Tuân thủ lệnh 100% (Rule 0): </w:t>
       </w:r>
       <w:r>
         <w:rPr>
-          <w:sz w:val="20"/>
+          <w:sz w:val="23"/>
         </w:rPr>
         <w:t>Chỉ thực hiện đúng những gì User yêu cầu, chính xác tuyệt đối, báo cáo minh bạch và chờ lệnh tiếp theo sau mỗi bước.</w:t>
       </w:r>
     </w:p>
     <w:p>
       <w:pPr>
-        <w:spacing w:before="80" w:after="60"/>
+        <w:spacing w:before="100" w:after="80" w:line="288" w:lineRule="auto"/>
         <w:ind w:left="288"/>
       </w:pPr>
       <w:r>
         <w:rPr>
           <w:b/>
           <w:color w:val="1E3A8A"/>
+          <w:sz w:val="24"/>
         </w:rPr>
         <w:t xml:space="preserve">2. </w:t>
       </w:r>
@@ -4066,25 +4069,27 @@
         <w:rPr>
           <w:b/>
           <w:color w:val="1E3A8A"/>
+          <w:sz w:val="24"/>
         </w:rPr>
         <w:t xml:space="preserve">Anti-Scope Creep: </w:t>
       </w:r>
       <w:r>
         <w:rPr>
-          <w:sz w:val="20"/>
+          <w:sz w:val="23"/>
         </w:rPr>
         <w:t>Giữ vững Sovereign Modular Monolith (.NET 9 LTS), kiên quyết không cài đặt Kafka, Redis, RabbitMQ hay Kubernetes.</w:t>
       </w:r>
     </w:p>
     <w:p>
       <w:pPr>
-        <w:spacing w:before="80" w:after="60"/>
+        <w:spacing w:before="100" w:after="80" w:line="288" w:lineRule="auto"/>
         <w:ind w:left="288"/>
       </w:pPr>
       <w:r>
         <w:rPr>
           <w:b/>
           <w:color w:val="1E3A8A"/>
+          <w:sz w:val="24"/>
         </w:rPr>
         <w:t xml:space="preserve">3. </w:t>
       </w:r>
@@ -4092,25 +4097,27 @@
         <w:rPr>
           <w:b/>
           <w:color w:val="1E3A8A"/>
+          <w:sz w:val="24"/>
         </w:rPr>
         <w:t xml:space="preserve">Zero-Preview: </w:t>
       </w:r>
       <w:r>
         <w:rPr>
-          <w:sz w:val="20"/>
+          <w:sz w:val="23"/>
         </w:rPr>
         <w:t>Sử dụng 100% phiên bản thư viện ổn định LTS.</w:t>
       </w:r>
     </w:p>
     <w:p>
       <w:pPr>
-        <w:spacing w:before="80" w:after="60"/>
+        <w:spacing w:before="100" w:after="80" w:line="288" w:lineRule="auto"/>
         <w:ind w:left="288"/>
       </w:pPr>
       <w:r>
         <w:rPr>
           <w:b/>
           <w:color w:val="1E3A8A"/>
+          <w:sz w:val="24"/>
         </w:rPr>
         <w:t xml:space="preserve">4. </w:t>
       </w:r>
@@ -4118,144 +4125,146 @@
         <w:rPr>
           <w:b/>
           <w:color w:val="1E3A8A"/>
+          <w:sz w:val="24"/>
         </w:rPr>
         <w:t xml:space="preserve">Bảo tồn Invariants P0/P1: </w:t>
       </w:r>
       <w:r>
         <w:rPr>
-          <w:sz w:val="20"/>
+          <w:sz w:val="23"/>
         </w:rPr>
       </w:r>
     </w:p>
     <w:p>
       <w:pPr>
-        <w:spacing w:before="20" w:after="40"/>
+        <w:spacing w:before="40" w:after="60" w:line="288" w:lineRule="auto"/>
         <w:ind w:left="792"/>
       </w:pPr>
       <w:r>
         <w:rPr>
           <w:color w:val="64748B"/>
-          <w:sz w:val="19"/>
+          <w:sz w:val="23"/>
         </w:rPr>
         <w:t xml:space="preserve">• </w:t>
       </w:r>
       <w:r>
         <w:rPr>
           <w:color w:val="334155"/>
-          <w:sz w:val="19"/>
+          <w:sz w:val="23"/>
         </w:rPr>
         <w:t>`DeviceTokenHash.ToLowerInvariant()` trên toàn bộ hệ thống.</w:t>
       </w:r>
     </w:p>
     <w:p>
       <w:pPr>
-        <w:spacing w:before="20" w:after="40"/>
+        <w:spacing w:before="40" w:after="60" w:line="288" w:lineRule="auto"/>
         <w:ind w:left="792"/>
       </w:pPr>
       <w:r>
         <w:rPr>
           <w:color w:val="64748B"/>
-          <w:sz w:val="19"/>
+          <w:sz w:val="23"/>
         </w:rPr>
         <w:t xml:space="preserve">• </w:t>
       </w:r>
       <w:r>
         <w:rPr>
           <w:color w:val="334155"/>
-          <w:sz w:val="19"/>
+          <w:sz w:val="23"/>
         </w:rPr>
         <w:t>Header HTTP xác thực bắt buộc là `X-DeviceId`.</w:t>
       </w:r>
     </w:p>
     <w:p>
       <w:pPr>
-        <w:spacing w:before="20" w:after="40"/>
+        <w:spacing w:before="40" w:after="60" w:line="288" w:lineRule="auto"/>
         <w:ind w:left="792"/>
       </w:pPr>
       <w:r>
         <w:rPr>
           <w:color w:val="64748B"/>
-          <w:sz w:val="19"/>
+          <w:sz w:val="23"/>
         </w:rPr>
         <w:t xml:space="preserve">• </w:t>
       </w:r>
       <w:r>
         <w:rPr>
           <w:color w:val="334155"/>
-          <w:sz w:val="19"/>
+          <w:sz w:val="23"/>
         </w:rPr>
         <w:t>Bộ lọc trùng lặp chỉ bắt trên `ProcessedTelemetryLedgers`.</w:t>
       </w:r>
     </w:p>
     <w:p>
       <w:pPr>
-        <w:spacing w:before="20" w:after="40"/>
+        <w:spacing w:before="40" w:after="60" w:line="288" w:lineRule="auto"/>
         <w:ind w:left="792"/>
       </w:pPr>
       <w:r>
         <w:rPr>
           <w:color w:val="64748B"/>
-          <w:sz w:val="19"/>
+          <w:sz w:val="23"/>
         </w:rPr>
         <w:t xml:space="preserve">• </w:t>
       </w:r>
       <w:r>
         <w:rPr>
           <w:color w:val="334155"/>
-          <w:sz w:val="19"/>
+          <w:sz w:val="23"/>
         </w:rPr>
         <w:t>Gói tin Fast-Lane SOS lưu toàn bộ các mẫu sinh hiệu đi kèm (Fact 35).</w:t>
       </w:r>
     </w:p>
     <w:p>
       <w:pPr>
-        <w:spacing w:before="20" w:after="40"/>
+        <w:spacing w:before="40" w:after="60" w:line="288" w:lineRule="auto"/>
         <w:ind w:left="792"/>
       </w:pPr>
       <w:r>
         <w:rPr>
           <w:color w:val="64748B"/>
-          <w:sz w:val="19"/>
+          <w:sz w:val="23"/>
         </w:rPr>
         <w:t xml:space="preserve">• </w:t>
       </w:r>
       <w:r>
         <w:rPr>
           <w:color w:val="334155"/>
-          <w:sz w:val="19"/>
+          <w:sz w:val="23"/>
         </w:rPr>
         <w:t>Filtered Unique Index `UIX_Incidents_SingleActiveElder` trên `Incidents`.</w:t>
       </w:r>
     </w:p>
     <w:p>
       <w:pPr>
-        <w:spacing w:before="20" w:after="40"/>
+        <w:spacing w:before="40" w:after="60" w:line="288" w:lineRule="auto"/>
         <w:ind w:left="792"/>
       </w:pPr>
       <w:r>
         <w:rPr>
           <w:color w:val="64748B"/>
-          <w:sz w:val="19"/>
+          <w:sz w:val="23"/>
         </w:rPr>
         <w:t xml:space="preserve">• </w:t>
       </w:r>
       <w:r>
         <w:rPr>
           <w:color w:val="334155"/>
-          <w:sz w:val="19"/>
+          <w:sz w:val="23"/>
         </w:rPr>
         <w:t>Native Android Direct Boot và phân vùng Device Protected Storage giữ vững nguyên vẹn.</w:t>
       </w:r>
     </w:p>
     <w:p>
       <w:pPr>
-        <w:spacing w:before="80" w:after="60"/>
+        <w:spacing w:before="100" w:after="80" w:line="288" w:lineRule="auto"/>
         <w:ind w:left="288"/>
       </w:pPr>
       <w:r>
         <w:rPr>
           <w:b/>
           <w:color w:val="1E3A8A"/>
+          <w:sz w:val="24"/>
         </w:rPr>
         <w:t xml:space="preserve">5. </w:t>
       </w:r>
@@ -4263,12 +4272,13 @@
         <w:rPr>
           <w:b/>
           <w:color w:val="1E3A8A"/>
+          <w:sz w:val="24"/>
         </w:rPr>
         <w:t xml:space="preserve">Kỷ luật kiểm thử: </w:t>
       </w:r>
       <w:r>
         <w:rPr>
-          <w:sz w:val="20"/>
+          <w:sz w:val="23"/>
         </w:rPr>
         <w:t>Mọi tính năng phải build được thật (`dotnet build` 0 warning, 0 error), test pass thật (100% Facts Passed), và kiểm thử thực địa minh bạch trên thiết bị thật Samsung Galaxy A55 5G.</w:t>
       </w:r>
@@ -4276,35 +4286,35 @@
     <w:p>
       <w:pPr>
         <w:keepNext/>
-        <w:spacing w:before="280" w:after="120"/>
+        <w:spacing w:before="320" w:after="120"/>
       </w:pPr>
       <w:r>
         <w:rPr>
           <w:rFonts w:ascii="Calibri" w:hAnsi="Calibri"/>
           <w:b/>
           <w:color w:val="1E3A8A"/>
-          <w:sz w:val="27"/>
+          <w:sz w:val="31"/>
         </w:rPr>
         <w:t>7. YÊU CẦU BẮT BUỘC VỀ THIẾT KẾ GIAO DIỆN (UI/UX) THEO NHIỆM VỤ</w:t>
       </w:r>
     </w:p>
     <w:p>
       <w:pPr>
-        <w:spacing w:before="20" w:after="40"/>
+        <w:spacing w:before="40" w:after="60" w:line="288" w:lineRule="auto"/>
         <w:ind w:left="504"/>
       </w:pPr>
       <w:r>
         <w:rPr>
           <w:b/>
           <w:color w:val="1E293B"/>
-          <w:sz w:val="19"/>
+          <w:sz w:val="23"/>
         </w:rPr>
         <w:t xml:space="preserve">• Trách nhiệm tự điều chỉnh &amp; thiết kế lại UI: </w:t>
       </w:r>
       <w:r>
         <w:rPr>
           <w:color w:val="475569"/>
-          <w:sz w:val="19"/>
+          <w:sz w:val="23"/>
         </w:rPr>
         <w:t>Mỗi thành viên khi đảm nhận phần chức năng/nhiệm vụ nào trong kế hoạch có trách nhiệm tự chủ động rà soát, điều chỉnh và thiết kế lại toàn bộ giao diện (UI/UX) của phân hệ/tính năng đó sao cho thân thiện, trực quan, dễ thao tác và phù hợp tối đa với người dùng (người cao tuổi cần chữ lớn rõ ràng, tương phản cao, thao tác tối giản; người thân cần bảng điều khiển nắm bắt thông tin trong 3 giây và xử lý cấp cứu tức thì).</w:t>
       </w:r>
@@ -4313,7 +4323,7 @@
       <w:headerReference w:type="default" r:id="rId9"/>
       <w:footerReference w:type="default" r:id="rId10"/>
       <w:pgSz w:w="12240" w:h="15840"/>
-      <w:pgMar w:top="1152" w:right="1152" w:bottom="1152" w:left="1152" w:header="720" w:footer="720" w:gutter="0"/>
+      <w:pgMar w:top="1080" w:right="1080" w:bottom="1080" w:left="1080" w:header="720" w:footer="720" w:gutter="0"/>
       <w:cols w:space="720"/>
       <w:docGrid w:linePitch="360"/>
     </w:sectPr>
@@ -4332,7 +4342,7 @@
       <w:rPr>
         <w:rFonts w:ascii="Calibri" w:hAnsi="Calibri"/>
         <w:color w:val="94A3B8"/>
-        <w:sz w:val="17"/>
+        <w:sz w:val="19"/>
       </w:rPr>
       <w:t>Hệ Thống Y Tế Từ Xa &amp; Cảnh Báo Cấp Cứu Gia Đình CareAI • Bảo Mật &amp; Độc Bản</w:t>
     </w:r>
@@ -4351,7 +4361,7 @@
       <w:rPr>
         <w:rFonts w:ascii="Calibri" w:hAnsi="Calibri"/>
         <w:color w:val="94A3B8"/>
-        <w:sz w:val="17"/>
+        <w:sz w:val="19"/>
       </w:rPr>
       <w:t>CareAI v111.0 — Kế Hoạch Triển Khai 4 Phần</w:t>
     </w:r>
@@ -4725,7 +4735,7 @@
     <w:rPr>
       <w:rFonts w:ascii="Calibri" w:hAnsi="Calibri"/>
       <w:color w:val="1E293B"/>
-      <w:sz w:val="21"/>
+      <w:sz w:val="24"/>
     </w:rPr>
   </w:style>
   <w:style w:type="paragraph" w:styleId="Header">

</xml_diff>